<commit_message>
Added Message box alert for situations where a user clicks the Video Playback button after selecting an event without an accompanied video.
Wrote a rough draft of the TcHmi section of the README.
</commit_message>
<xml_diff>
--- a/VideoPlaybackSupportFiles/README - Project Setup Notes.docx
+++ b/VideoPlaybackSupportFiles/README - Project Setup Notes.docx
@@ -1,6 +1,6 @@
 
 <file path=word/document.xml><?xml version="1.0" encoding="utf-8"?>
-<w:document xmlns:wpc="http://schemas.microsoft.com/office/word/2010/wordprocessingCanvas" xmlns:cx="http://schemas.microsoft.com/office/drawing/2014/chartex" xmlns:cx1="http://schemas.microsoft.com/office/drawing/2015/9/8/chartex" xmlns:cx2="http://schemas.microsoft.com/office/drawing/2015/10/21/chartex" xmlns:cx3="http://schemas.microsoft.com/office/drawing/2016/5/9/chartex" xmlns:cx4="http://schemas.microsoft.com/office/drawing/2016/5/10/chartex" xmlns:cx5="http://schemas.microsoft.com/office/drawing/2016/5/11/chartex" xmlns:cx6="http://schemas.microsoft.com/office/drawing/2016/5/12/chartex" xmlns:cx7="http://schemas.microsoft.com/office/drawing/2016/5/13/chartex" xmlns:cx8="http://schemas.microsoft.com/office/drawing/2016/5/14/chartex" xmlns:mc="http://schemas.openxmlformats.org/markup-compatibility/2006" xmlns:aink="http://schemas.microsoft.com/office/drawing/2016/ink" xmlns:am3d="http://schemas.microsoft.com/office/drawing/2017/model3d" xmlns:o="urn:schemas-microsoft-com:office:office" xmlns:r="http://schemas.openxmlformats.org/officeDocument/2006/relationships" xmlns:m="http://schemas.openxmlformats.org/officeDocument/2006/math" xmlns:v="urn:schemas-microsoft-com:vml" xmlns:wp14="http://schemas.microsoft.com/office/word/2010/wordprocessingDrawing" xmlns:wp="http://schemas.openxmlformats.org/drawingml/2006/wordprocessingDrawing" xmlns:w10="urn:schemas-microsoft-com:office:word" xmlns:w="http://schemas.openxmlformats.org/wordprocessingml/2006/main" xmlns:w14="http://schemas.microsoft.com/office/word/2010/wordml" xmlns:w15="http://schemas.microsoft.com/office/word/2012/wordml" xmlns:w16cex="http://schemas.microsoft.com/office/word/2018/wordml/cex" xmlns:w16cid="http://schemas.microsoft.com/office/word/2016/wordml/cid" xmlns:w16="http://schemas.microsoft.com/office/word/2018/wordml" xmlns:w16sdtdh="http://schemas.microsoft.com/office/word/2020/wordml/sdtdatahash" xmlns:w16se="http://schemas.microsoft.com/office/word/2015/wordml/symex" xmlns:wpg="http://schemas.microsoft.com/office/word/2010/wordprocessingGroup" xmlns:wpi="http://schemas.microsoft.com/office/word/2010/wordprocessingInk" xmlns:wne="http://schemas.microsoft.com/office/word/2006/wordml" xmlns:wps="http://schemas.microsoft.com/office/word/2010/wordprocessingShape" mc:Ignorable="w14 w15 w16se w16cid w16 w16cex w16sdtdh wp14">
+<w:document xmlns:wpc="http://schemas.microsoft.com/office/word/2010/wordprocessingCanvas" xmlns:cx="http://schemas.microsoft.com/office/drawing/2014/chartex" xmlns:cx1="http://schemas.microsoft.com/office/drawing/2015/9/8/chartex" xmlns:mc="http://schemas.openxmlformats.org/markup-compatibility/2006" xmlns:o="urn:schemas-microsoft-com:office:office" xmlns:r="http://schemas.openxmlformats.org/officeDocument/2006/relationships" xmlns:m="http://schemas.openxmlformats.org/officeDocument/2006/math" xmlns:v="urn:schemas-microsoft-com:vml" xmlns:wp14="http://schemas.microsoft.com/office/word/2010/wordprocessingDrawing" xmlns:wp="http://schemas.openxmlformats.org/drawingml/2006/wordprocessingDrawing" xmlns:w10="urn:schemas-microsoft-com:office:word" xmlns:w="http://schemas.openxmlformats.org/wordprocessingml/2006/main" xmlns:w14="http://schemas.microsoft.com/office/word/2010/wordml" xmlns:w15="http://schemas.microsoft.com/office/word/2012/wordml" xmlns:w16se="http://schemas.microsoft.com/office/word/2015/wordml/symex" xmlns:wpg="http://schemas.microsoft.com/office/word/2010/wordprocessingGroup" xmlns:wpi="http://schemas.microsoft.com/office/word/2010/wordprocessingInk" xmlns:wne="http://schemas.microsoft.com/office/word/2006/wordml" xmlns:wps="http://schemas.microsoft.com/office/word/2010/wordprocessingShape" mc:Ignorable="w14 w15 w16se wp14">
   <w:body>
     <w:p>
       <w:pPr>
@@ -549,11 +549,9 @@
       <w:r>
         <w:t xml:space="preserve">TwinCAT project and HMI project are in archive file: </w:t>
       </w:r>
-      <w:proofErr w:type="spellStart"/>
       <w:r>
         <w:t>TcVis_ShapeColor_stream_Solution.tnzip</w:t>
       </w:r>
-      <w:proofErr w:type="spellEnd"/>
     </w:p>
     <w:p>
       <w:r>
@@ -767,15 +765,7 @@
               <w:jc w:val="center"/>
             </w:pPr>
             <w:r>
-              <w:t>&lt;</w:t>
-            </w:r>
-            <w:proofErr w:type="spellStart"/>
-            <w:r>
-              <w:t>VideoPath</w:t>
-            </w:r>
-            <w:proofErr w:type="spellEnd"/>
-            <w:r>
-              <w:t>&gt;</w:t>
+              <w:t>&lt;VideoPath&gt;</w:t>
             </w:r>
           </w:p>
         </w:tc>
@@ -802,15 +792,7 @@
               <w:jc w:val="center"/>
             </w:pPr>
             <w:r>
-              <w:t>&lt;</w:t>
-            </w:r>
-            <w:proofErr w:type="spellStart"/>
-            <w:r>
-              <w:t>ScopeImageExportPath</w:t>
-            </w:r>
-            <w:proofErr w:type="spellEnd"/>
-            <w:r>
-              <w:t>&gt;</w:t>
+              <w:t>&lt;ScopeImageExportPath&gt;</w:t>
             </w:r>
           </w:p>
         </w:tc>
@@ -864,39 +846,706 @@
       <w:bookmarkEnd w:id="3"/>
     </w:p>
     <w:p>
+      <w:pPr>
+        <w:pStyle w:val="Heading4"/>
+      </w:pPr>
       <w:r>
         <w:t>Virtual Directory</w:t>
       </w:r>
     </w:p>
     <w:p>
+      <w:pPr>
+        <w:ind w:firstLine="720"/>
+      </w:pPr>
+      <w:r>
+        <w:t>In order for the HMI server to load a video file, it needs to know where it should look. To give it a way to access the directory where the video files are stored, a virtual directory can be made in the TcHmiSrv setting of the project. This is located under the “Server” node of the solution explorer.</w:t>
+      </w:r>
+      <w:r>
+        <w:t xml:space="preserve"> </w:t>
+      </w:r>
+    </w:p>
+    <w:p>
+      <w:pPr>
+        <w:ind w:firstLine="720"/>
+      </w:pPr>
+      <w:r>
+        <w:t>First, these settings need to be made for the remote configuration</w:t>
+      </w:r>
+      <w:r>
+        <w:t>. From the dropdown labeled “Publish Configuration”, select remote (or if you have multiple configurations, which ever you plan to publish to the server). Then in the general tab, expand “Virtual directories” and click “Add Virtual directory.”</w:t>
+      </w:r>
+    </w:p>
+    <w:p>
+      <w:r>
+        <w:rPr>
+          <w:noProof/>
+        </w:rPr>
+        <w:lastRenderedPageBreak/>
+        <w:drawing>
+          <wp:inline distT="0" distB="0" distL="0" distR="0" wp14:anchorId="259B0B39" wp14:editId="72E89629">
+            <wp:extent cx="5943600" cy="3418205"/>
+            <wp:effectExtent l="0" t="0" r="0" b="0"/>
+            <wp:docPr id="3" name="Picture 3"/>
+            <wp:cNvGraphicFramePr>
+              <a:graphicFrameLocks xmlns:a="http://schemas.openxmlformats.org/drawingml/2006/main" noChangeAspect="1"/>
+            </wp:cNvGraphicFramePr>
+            <a:graphic xmlns:a="http://schemas.openxmlformats.org/drawingml/2006/main">
+              <a:graphicData uri="http://schemas.openxmlformats.org/drawingml/2006/picture">
+                <pic:pic xmlns:pic="http://schemas.openxmlformats.org/drawingml/2006/picture">
+                  <pic:nvPicPr>
+                    <pic:cNvPr id="1" name=""/>
+                    <pic:cNvPicPr/>
+                  </pic:nvPicPr>
+                  <pic:blipFill>
+                    <a:blip r:embed="rId12"/>
+                    <a:stretch>
+                      <a:fillRect/>
+                    </a:stretch>
+                  </pic:blipFill>
+                  <pic:spPr>
+                    <a:xfrm>
+                      <a:off x="0" y="0"/>
+                      <a:ext cx="5943600" cy="3418205"/>
+                    </a:xfrm>
+                    <a:prstGeom prst="rect">
+                      <a:avLst/>
+                    </a:prstGeom>
+                  </pic:spPr>
+                </pic:pic>
+              </a:graphicData>
+            </a:graphic>
+          </wp:inline>
+        </w:drawing>
+      </w:r>
+    </w:p>
+    <w:p>
+      <w:pPr>
+        <w:ind w:firstLine="720"/>
+      </w:pPr>
+      <w:r>
+        <w:t>In the new pop- Name the directory anything beginning with “/”(for this sample, it</w:t>
+      </w:r>
+      <w:r>
+        <w:t xml:space="preserve"> is named</w:t>
+      </w:r>
+      <w:r>
+        <w:t xml:space="preserve"> “/Videos”). And then enter the file path used for the virtual directory. This should be the same file p</w:t>
+      </w:r>
+      <w:r>
+        <w:t xml:space="preserve">ath used </w:t>
+      </w:r>
+      <w:r>
+        <w:t>in the PLC code.</w:t>
+      </w:r>
+    </w:p>
+    <w:p>
+      <w:r>
+        <w:rPr>
+          <w:noProof/>
+        </w:rPr>
+        <w:drawing>
+          <wp:inline distT="0" distB="0" distL="0" distR="0" wp14:anchorId="6D539F3B" wp14:editId="2039A1B0">
+            <wp:extent cx="5943600" cy="3469640"/>
+            <wp:effectExtent l="0" t="0" r="0" b="0"/>
+            <wp:docPr id="4" name="Picture 4"/>
+            <wp:cNvGraphicFramePr>
+              <a:graphicFrameLocks xmlns:a="http://schemas.openxmlformats.org/drawingml/2006/main" noChangeAspect="1"/>
+            </wp:cNvGraphicFramePr>
+            <a:graphic xmlns:a="http://schemas.openxmlformats.org/drawingml/2006/main">
+              <a:graphicData uri="http://schemas.openxmlformats.org/drawingml/2006/picture">
+                <pic:pic xmlns:pic="http://schemas.openxmlformats.org/drawingml/2006/picture">
+                  <pic:nvPicPr>
+                    <pic:cNvPr id="1" name=""/>
+                    <pic:cNvPicPr/>
+                  </pic:nvPicPr>
+                  <pic:blipFill>
+                    <a:blip r:embed="rId13"/>
+                    <a:stretch>
+                      <a:fillRect/>
+                    </a:stretch>
+                  </pic:blipFill>
+                  <pic:spPr>
+                    <a:xfrm>
+                      <a:off x="0" y="0"/>
+                      <a:ext cx="5943600" cy="3469640"/>
+                    </a:xfrm>
+                    <a:prstGeom prst="rect">
+                      <a:avLst/>
+                    </a:prstGeom>
+                  </pic:spPr>
+                </pic:pic>
+              </a:graphicData>
+            </a:graphic>
+          </wp:inline>
+        </w:drawing>
+      </w:r>
+    </w:p>
+    <w:p>
+      <w:pPr>
+        <w:ind w:firstLine="720"/>
+      </w:pPr>
+      <w:r>
+        <w:t xml:space="preserve">Once entered, click “Add” and then click “Accept.” With </w:t>
+      </w:r>
+      <w:r>
+        <w:t>that finished, the next time</w:t>
+      </w:r>
+      <w:r>
+        <w:t xml:space="preserve"> the HMI </w:t>
+      </w:r>
+      <w:r>
+        <w:t>is published</w:t>
+      </w:r>
+      <w:r>
+        <w:t xml:space="preserve">, the virtual directory will be </w:t>
+      </w:r>
+      <w:r>
+        <w:t>accessible</w:t>
+      </w:r>
+      <w:r>
+        <w:t>.</w:t>
+      </w:r>
+    </w:p>
+    <w:p>
+      <w:pPr>
+        <w:pStyle w:val="Heading4"/>
+      </w:pPr>
+      <w:r>
+        <w:lastRenderedPageBreak/>
+        <w:t>Contents</w:t>
+      </w:r>
+    </w:p>
+    <w:p>
+      <w:r>
+        <w:t>EventView</w:t>
+      </w:r>
+    </w:p>
+    <w:p>
+      <w:r>
+        <w:tab/>
+        <w:t>The EventView content contains an Event grid and 3 buttons. One for triggering a test event, one for clearing the active alarm, and one for playing the video of the selected event.</w:t>
+      </w:r>
+    </w:p>
+    <w:p>
+      <w:r>
+        <w:t>In order to play the video, the user simply clicks on the event they wish to view and then click the video playback button. If the video file exists, the content will be switched to the VideoPlayback content. There the video will be loaded</w:t>
+      </w:r>
+    </w:p>
+    <w:p>
+      <w:r>
+        <w:t>VideoPlayback</w:t>
+      </w:r>
+    </w:p>
+    <w:p>
+      <w:r>
+        <w:t>This content contains only the Video Player control for video playback. When adding the video player, it is important that the “SrcList” property be blank, or else the control</w:t>
+      </w:r>
+      <w:bookmarkStart w:id="4" w:name="_GoBack"/>
+      <w:bookmarkEnd w:id="4"/>
+      <w:r>
+        <w:t xml:space="preserve"> will throw an error when loaded.</w:t>
+      </w:r>
+    </w:p>
+    <w:p>
+      <w:pPr>
+        <w:pStyle w:val="Heading4"/>
+      </w:pPr>
       <w:r>
         <w:t>Functions</w:t>
       </w:r>
     </w:p>
+    <w:p>
+      <w:pPr>
+        <w:pStyle w:val="Heading5"/>
+      </w:pPr>
+      <w:r>
+        <w:t>OpenSelectedEventVideo</w:t>
+      </w:r>
+    </w:p>
+    <w:p>
+      <w:pPr>
+        <w:ind w:firstLine="720"/>
+      </w:pPr>
+      <w:r>
+        <w:t>To load the video file and play it, the HMI needs to perform a few steps first. When you select the desired event from the Event Grid, and press the Video Playback button, the HMI will start by grabbing the relevant data from the EventGrid.</w:t>
+      </w:r>
+      <w:r>
+        <w:t xml:space="preserve"> What it needs to find is the timestamp of when the event was received, which should be the same as the timestamp used in the PLC. </w:t>
+      </w:r>
+    </w:p>
+    <w:p>
+      <w:pPr>
+        <w:ind w:firstLine="720"/>
+      </w:pPr>
+      <w:r>
+        <w:t>The first section of this function gets the Event Grid and creates a variable for it in the function. Then, it gets the event currently selected by the user:</w:t>
+      </w:r>
+    </w:p>
+    <w:p>
+      <w:r>
+        <w:rPr>
+          <w:noProof/>
+        </w:rPr>
+        <w:drawing>
+          <wp:inline distT="0" distB="0" distL="0" distR="0" wp14:anchorId="2C45D765" wp14:editId="5552E1CA">
+            <wp:extent cx="5943600" cy="1461770"/>
+            <wp:effectExtent l="0" t="0" r="0" b="5080"/>
+            <wp:docPr id="5" name="Picture 5"/>
+            <wp:cNvGraphicFramePr>
+              <a:graphicFrameLocks xmlns:a="http://schemas.openxmlformats.org/drawingml/2006/main" noChangeAspect="1"/>
+            </wp:cNvGraphicFramePr>
+            <a:graphic xmlns:a="http://schemas.openxmlformats.org/drawingml/2006/main">
+              <a:graphicData uri="http://schemas.openxmlformats.org/drawingml/2006/picture">
+                <pic:pic xmlns:pic="http://schemas.openxmlformats.org/drawingml/2006/picture">
+                  <pic:nvPicPr>
+                    <pic:cNvPr id="1" name=""/>
+                    <pic:cNvPicPr/>
+                  </pic:nvPicPr>
+                  <pic:blipFill>
+                    <a:blip r:embed="rId14"/>
+                    <a:stretch>
+                      <a:fillRect/>
+                    </a:stretch>
+                  </pic:blipFill>
+                  <pic:spPr>
+                    <a:xfrm>
+                      <a:off x="0" y="0"/>
+                      <a:ext cx="5943600" cy="1461770"/>
+                    </a:xfrm>
+                    <a:prstGeom prst="rect">
+                      <a:avLst/>
+                    </a:prstGeom>
+                  </pic:spPr>
+                </pic:pic>
+              </a:graphicData>
+            </a:graphic>
+          </wp:inline>
+        </w:drawing>
+      </w:r>
+    </w:p>
+    <w:p>
+      <w:pPr>
+        <w:ind w:firstLine="720"/>
+      </w:pPr>
+      <w:r>
+        <w:t>Once it has the event and assigns its data to a variable, it begins creating the name of the video file using the “timeReceived” property of the variable. First, by turning each part of the time stamp into its own string, and then concatenating them into the file name. the function used for certain parts named “number2string” is used to be sure that single digit values have a “0” placed before them to match the format of the timestamp.</w:t>
+      </w:r>
+    </w:p>
+    <w:p>
+      <w:r>
+        <w:rPr>
+          <w:noProof/>
+        </w:rPr>
+        <w:drawing>
+          <wp:inline distT="0" distB="0" distL="0" distR="0" wp14:anchorId="01D5AE41" wp14:editId="27093A35">
+            <wp:extent cx="5943600" cy="1508760"/>
+            <wp:effectExtent l="0" t="0" r="0" b="0"/>
+            <wp:docPr id="6" name="Picture 6"/>
+            <wp:cNvGraphicFramePr>
+              <a:graphicFrameLocks xmlns:a="http://schemas.openxmlformats.org/drawingml/2006/main" noChangeAspect="1"/>
+            </wp:cNvGraphicFramePr>
+            <a:graphic xmlns:a="http://schemas.openxmlformats.org/drawingml/2006/main">
+              <a:graphicData uri="http://schemas.openxmlformats.org/drawingml/2006/picture">
+                <pic:pic xmlns:pic="http://schemas.openxmlformats.org/drawingml/2006/picture">
+                  <pic:nvPicPr>
+                    <pic:cNvPr id="1" name=""/>
+                    <pic:cNvPicPr/>
+                  </pic:nvPicPr>
+                  <pic:blipFill>
+                    <a:blip r:embed="rId15"/>
+                    <a:stretch>
+                      <a:fillRect/>
+                    </a:stretch>
+                  </pic:blipFill>
+                  <pic:spPr>
+                    <a:xfrm>
+                      <a:off x="0" y="0"/>
+                      <a:ext cx="5943600" cy="1508760"/>
+                    </a:xfrm>
+                    <a:prstGeom prst="rect">
+                      <a:avLst/>
+                    </a:prstGeom>
+                  </pic:spPr>
+                </pic:pic>
+              </a:graphicData>
+            </a:graphic>
+          </wp:inline>
+        </w:drawing>
+      </w:r>
+    </w:p>
+    <w:p>
+      <w:r>
+        <w:lastRenderedPageBreak/>
+        <w:tab/>
+      </w:r>
+      <w:r>
+        <w:t>The UTC timestamp is used, because the Event Logger uses the same for the time raised timestamp in the PLC, which is what is used to name the video file during its creation.</w:t>
+      </w:r>
+    </w:p>
+    <w:p>
+      <w:pPr>
+        <w:ind w:firstLine="720"/>
+      </w:pPr>
+      <w:r>
+        <w:t>Once the filename is created, the function calls the CheckforVideo function to make sure the file is in the virtual directory. If it is not found in the virtual directory, the function ends here.</w:t>
+      </w:r>
+      <w:r>
+        <w:t xml:space="preserve"> How this function is programmed is shown later.</w:t>
+      </w:r>
+    </w:p>
+    <w:p>
+      <w:r>
+        <w:rPr>
+          <w:noProof/>
+        </w:rPr>
+        <w:drawing>
+          <wp:inline distT="0" distB="0" distL="0" distR="0" wp14:anchorId="1C6ADCD1" wp14:editId="20E5B116">
+            <wp:extent cx="5943600" cy="784225"/>
+            <wp:effectExtent l="0" t="0" r="0" b="0"/>
+            <wp:docPr id="7" name="Picture 7"/>
+            <wp:cNvGraphicFramePr>
+              <a:graphicFrameLocks xmlns:a="http://schemas.openxmlformats.org/drawingml/2006/main" noChangeAspect="1"/>
+            </wp:cNvGraphicFramePr>
+            <a:graphic xmlns:a="http://schemas.openxmlformats.org/drawingml/2006/main">
+              <a:graphicData uri="http://schemas.openxmlformats.org/drawingml/2006/picture">
+                <pic:pic xmlns:pic="http://schemas.openxmlformats.org/drawingml/2006/picture">
+                  <pic:nvPicPr>
+                    <pic:cNvPr id="1" name=""/>
+                    <pic:cNvPicPr/>
+                  </pic:nvPicPr>
+                  <pic:blipFill>
+                    <a:blip r:embed="rId16"/>
+                    <a:stretch>
+                      <a:fillRect/>
+                    </a:stretch>
+                  </pic:blipFill>
+                  <pic:spPr>
+                    <a:xfrm>
+                      <a:off x="0" y="0"/>
+                      <a:ext cx="5943600" cy="784225"/>
+                    </a:xfrm>
+                    <a:prstGeom prst="rect">
+                      <a:avLst/>
+                    </a:prstGeom>
+                  </pic:spPr>
+                </pic:pic>
+              </a:graphicData>
+            </a:graphic>
+          </wp:inline>
+        </w:drawing>
+      </w:r>
+    </w:p>
+    <w:p>
+      <w:pPr>
+        <w:ind w:firstLine="720"/>
+      </w:pPr>
+      <w:r>
+        <w:t>If the video file is found, the function then switches the currently viewed content of the region to display the video player.</w:t>
+      </w:r>
+      <w:r>
+        <w:t xml:space="preserve"> The function is told to wait a certain number of milliseconds to ensure that the content is loaded, and the video player element is attached before getting the player and assigning it to a variable. Finally the function appends the virtual directory to the filename, and sets the video player’s source to said file path. The video immediately begins playing after.</w:t>
+      </w:r>
+    </w:p>
+    <w:p>
+      <w:r>
+        <w:rPr>
+          <w:noProof/>
+        </w:rPr>
+        <w:drawing>
+          <wp:inline distT="0" distB="0" distL="0" distR="0" wp14:anchorId="5EF61F48" wp14:editId="231AF190">
+            <wp:extent cx="5619048" cy="3009524"/>
+            <wp:effectExtent l="0" t="0" r="1270" b="635"/>
+            <wp:docPr id="8" name="Picture 8"/>
+            <wp:cNvGraphicFramePr>
+              <a:graphicFrameLocks xmlns:a="http://schemas.openxmlformats.org/drawingml/2006/main" noChangeAspect="1"/>
+            </wp:cNvGraphicFramePr>
+            <a:graphic xmlns:a="http://schemas.openxmlformats.org/drawingml/2006/main">
+              <a:graphicData uri="http://schemas.openxmlformats.org/drawingml/2006/picture">
+                <pic:pic xmlns:pic="http://schemas.openxmlformats.org/drawingml/2006/picture">
+                  <pic:nvPicPr>
+                    <pic:cNvPr id="1" name=""/>
+                    <pic:cNvPicPr/>
+                  </pic:nvPicPr>
+                  <pic:blipFill>
+                    <a:blip r:embed="rId17"/>
+                    <a:stretch>
+                      <a:fillRect/>
+                    </a:stretch>
+                  </pic:blipFill>
+                  <pic:spPr>
+                    <a:xfrm>
+                      <a:off x="0" y="0"/>
+                      <a:ext cx="5619048" cy="3009524"/>
+                    </a:xfrm>
+                    <a:prstGeom prst="rect">
+                      <a:avLst/>
+                    </a:prstGeom>
+                  </pic:spPr>
+                </pic:pic>
+              </a:graphicData>
+            </a:graphic>
+          </wp:inline>
+        </w:drawing>
+      </w:r>
+    </w:p>
+    <w:p>
+      <w:r>
+        <w:t>This is the sleep function created to force the function to wait a certain number of milliseconds.</w:t>
+      </w:r>
+    </w:p>
+    <w:p>
+      <w:r>
+        <w:rPr>
+          <w:noProof/>
+        </w:rPr>
+        <w:drawing>
+          <wp:inline distT="0" distB="0" distL="0" distR="0" wp14:anchorId="575C7CCF" wp14:editId="122CF7EE">
+            <wp:extent cx="4266667" cy="438095"/>
+            <wp:effectExtent l="0" t="0" r="635" b="635"/>
+            <wp:docPr id="13" name="Picture 13"/>
+            <wp:cNvGraphicFramePr>
+              <a:graphicFrameLocks xmlns:a="http://schemas.openxmlformats.org/drawingml/2006/main" noChangeAspect="1"/>
+            </wp:cNvGraphicFramePr>
+            <a:graphic xmlns:a="http://schemas.openxmlformats.org/drawingml/2006/main">
+              <a:graphicData uri="http://schemas.openxmlformats.org/drawingml/2006/picture">
+                <pic:pic xmlns:pic="http://schemas.openxmlformats.org/drawingml/2006/picture">
+                  <pic:nvPicPr>
+                    <pic:cNvPr id="1" name=""/>
+                    <pic:cNvPicPr/>
+                  </pic:nvPicPr>
+                  <pic:blipFill>
+                    <a:blip r:embed="rId18"/>
+                    <a:stretch>
+                      <a:fillRect/>
+                    </a:stretch>
+                  </pic:blipFill>
+                  <pic:spPr>
+                    <a:xfrm>
+                      <a:off x="0" y="0"/>
+                      <a:ext cx="4266667" cy="438095"/>
+                    </a:xfrm>
+                    <a:prstGeom prst="rect">
+                      <a:avLst/>
+                    </a:prstGeom>
+                  </pic:spPr>
+                </pic:pic>
+              </a:graphicData>
+            </a:graphic>
+          </wp:inline>
+        </w:drawing>
+      </w:r>
+    </w:p>
+    <w:p>
+      <w:r>
+        <w:t>Here is the simple function for making sure the timestamp portion fits the format of the video file.</w:t>
+      </w:r>
+    </w:p>
+    <w:p>
+      <w:r>
+        <w:rPr>
+          <w:noProof/>
+        </w:rPr>
+        <w:lastRenderedPageBreak/>
+        <w:drawing>
+          <wp:inline distT="0" distB="0" distL="0" distR="0" wp14:anchorId="6A802C35" wp14:editId="568220C8">
+            <wp:extent cx="5943600" cy="955675"/>
+            <wp:effectExtent l="0" t="0" r="0" b="0"/>
+            <wp:docPr id="10" name="Picture 10"/>
+            <wp:cNvGraphicFramePr>
+              <a:graphicFrameLocks xmlns:a="http://schemas.openxmlformats.org/drawingml/2006/main" noChangeAspect="1"/>
+            </wp:cNvGraphicFramePr>
+            <a:graphic xmlns:a="http://schemas.openxmlformats.org/drawingml/2006/main">
+              <a:graphicData uri="http://schemas.openxmlformats.org/drawingml/2006/picture">
+                <pic:pic xmlns:pic="http://schemas.openxmlformats.org/drawingml/2006/picture">
+                  <pic:nvPicPr>
+                    <pic:cNvPr id="1" name=""/>
+                    <pic:cNvPicPr/>
+                  </pic:nvPicPr>
+                  <pic:blipFill>
+                    <a:blip r:embed="rId19"/>
+                    <a:stretch>
+                      <a:fillRect/>
+                    </a:stretch>
+                  </pic:blipFill>
+                  <pic:spPr>
+                    <a:xfrm>
+                      <a:off x="0" y="0"/>
+                      <a:ext cx="5943600" cy="955675"/>
+                    </a:xfrm>
+                    <a:prstGeom prst="rect">
+                      <a:avLst/>
+                    </a:prstGeom>
+                  </pic:spPr>
+                </pic:pic>
+              </a:graphicData>
+            </a:graphic>
+          </wp:inline>
+        </w:drawing>
+      </w:r>
+    </w:p>
+    <w:p>
+      <w:pPr>
+        <w:pStyle w:val="Heading5"/>
+      </w:pPr>
+      <w:r>
+        <w:t>CheckForVideo</w:t>
+      </w:r>
+    </w:p>
+    <w:p>
+      <w:pPr>
+        <w:ind w:firstLine="720"/>
+      </w:pPr>
+      <w:r>
+        <w:t xml:space="preserve">This function is used to </w:t>
+      </w:r>
+      <w:r>
+        <w:t>check if a specific file exists within the virtual directory you created previously. It accepts a file name as a string, and then calls a server function to get a list of files, and checks if the filename is a part of that list by key.</w:t>
+      </w:r>
+    </w:p>
+    <w:p>
+      <w:r>
+        <w:tab/>
+        <w:t xml:space="preserve">To begin, the function creates a Promise so the function will not end before its task is complete. Within the Promise, the function “TcHmi.Server.writeSymbol” is called. The symbol being written to is “ListFiles”, which is a function in the server that lists the contents of the folder path written to it. In this case, the folder is the virtual directory created previously (“/Videos” in this sample). When ListFiles is complete, the contents will be returned through a callback. The </w:t>
+      </w:r>
+      <w:r>
+        <w:t>Promise</w:t>
+      </w:r>
+      <w:r>
+        <w:t xml:space="preserve"> checks the data returned in the “data.results[]” object to see if there is a value with a key matching the file name it was passed. If it was found the Pormise resolves as true, if it is not found, it resolves as false. </w:t>
+      </w:r>
+    </w:p>
+    <w:p>
+      <w:r>
+        <w:rPr>
+          <w:noProof/>
+        </w:rPr>
+        <w:drawing>
+          <wp:inline distT="0" distB="0" distL="0" distR="0" wp14:anchorId="0F3CAF23" wp14:editId="404EFBE9">
+            <wp:extent cx="5936615" cy="3964940"/>
+            <wp:effectExtent l="0" t="0" r="6985" b="0"/>
+            <wp:docPr id="11" name="Picture 11" descr="C:\Users\NathanM\AppData\Local\Temp\\SnagitTemp\Snag_46efd9.png"/>
+            <wp:cNvGraphicFramePr>
+              <a:graphicFrameLocks xmlns:a="http://schemas.openxmlformats.org/drawingml/2006/main" noChangeAspect="1"/>
+            </wp:cNvGraphicFramePr>
+            <a:graphic xmlns:a="http://schemas.openxmlformats.org/drawingml/2006/main">
+              <a:graphicData uri="http://schemas.openxmlformats.org/drawingml/2006/picture">
+                <pic:pic xmlns:pic="http://schemas.openxmlformats.org/drawingml/2006/picture">
+                  <pic:nvPicPr>
+                    <pic:cNvPr id="0" name="Picture 1" descr="C:\Users\NathanM\AppData\Local\Temp\\SnagitTemp\Snag_46efd9.png"/>
+                    <pic:cNvPicPr>
+                      <a:picLocks noChangeAspect="1" noChangeArrowheads="1"/>
+                    </pic:cNvPicPr>
+                  </pic:nvPicPr>
+                  <pic:blipFill>
+                    <a:blip r:embed="rId20">
+                      <a:extLst>
+                        <a:ext uri="{28A0092B-C50C-407E-A947-70E740481C1C}">
+                          <a14:useLocalDpi xmlns:a14="http://schemas.microsoft.com/office/drawing/2010/main" val="0"/>
+                        </a:ext>
+                      </a:extLst>
+                    </a:blip>
+                    <a:srcRect/>
+                    <a:stretch>
+                      <a:fillRect/>
+                    </a:stretch>
+                  </pic:blipFill>
+                  <pic:spPr bwMode="auto">
+                    <a:xfrm>
+                      <a:off x="0" y="0"/>
+                      <a:ext cx="5936615" cy="3964940"/>
+                    </a:xfrm>
+                    <a:prstGeom prst="rect">
+                      <a:avLst/>
+                    </a:prstGeom>
+                    <a:noFill/>
+                    <a:ln>
+                      <a:noFill/>
+                    </a:ln>
+                  </pic:spPr>
+                </pic:pic>
+              </a:graphicData>
+            </a:graphic>
+          </wp:inline>
+        </w:drawing>
+      </w:r>
+    </w:p>
+    <w:p>
+      <w:r>
+        <w:t xml:space="preserve">With the promise declared, it is then called, and the resolved value is passed to a Boolean </w:t>
+      </w:r>
+      <w:r>
+        <w:t xml:space="preserve">variable in the CheckforVideo function </w:t>
+      </w:r>
+      <w:r>
+        <w:t>which is returned to the function’s caller.</w:t>
+      </w:r>
+    </w:p>
+    <w:p>
+      <w:r>
+        <w:rPr>
+          <w:noProof/>
+        </w:rPr>
+        <w:lastRenderedPageBreak/>
+        <w:drawing>
+          <wp:inline distT="0" distB="0" distL="0" distR="0" wp14:anchorId="27E3B879" wp14:editId="6628C1F6">
+            <wp:extent cx="5161905" cy="1219048"/>
+            <wp:effectExtent l="0" t="0" r="1270" b="635"/>
+            <wp:docPr id="12" name="Picture 12"/>
+            <wp:cNvGraphicFramePr>
+              <a:graphicFrameLocks xmlns:a="http://schemas.openxmlformats.org/drawingml/2006/main" noChangeAspect="1"/>
+            </wp:cNvGraphicFramePr>
+            <a:graphic xmlns:a="http://schemas.openxmlformats.org/drawingml/2006/main">
+              <a:graphicData uri="http://schemas.openxmlformats.org/drawingml/2006/picture">
+                <pic:pic xmlns:pic="http://schemas.openxmlformats.org/drawingml/2006/picture">
+                  <pic:nvPicPr>
+                    <pic:cNvPr id="1" name=""/>
+                    <pic:cNvPicPr/>
+                  </pic:nvPicPr>
+                  <pic:blipFill>
+                    <a:blip r:embed="rId21"/>
+                    <a:stretch>
+                      <a:fillRect/>
+                    </a:stretch>
+                  </pic:blipFill>
+                  <pic:spPr>
+                    <a:xfrm>
+                      <a:off x="0" y="0"/>
+                      <a:ext cx="5161905" cy="1219048"/>
+                    </a:xfrm>
+                    <a:prstGeom prst="rect">
+                      <a:avLst/>
+                    </a:prstGeom>
+                  </pic:spPr>
+                </pic:pic>
+              </a:graphicData>
+            </a:graphic>
+          </wp:inline>
+        </w:drawing>
+      </w:r>
+    </w:p>
+    <w:p>
+      <w:pPr>
+        <w:pStyle w:val="Heading3"/>
+      </w:pPr>
+      <w:bookmarkStart w:id="5" w:name="_Toc94192273"/>
+      <w:r>
+        <w:t>PLC Setup</w:t>
+      </w:r>
+      <w:bookmarkEnd w:id="5"/>
+      <w:r>
+        <w:t xml:space="preserve"> </w:t>
+      </w:r>
+    </w:p>
     <w:p/>
     <w:p>
       <w:pPr>
         <w:pStyle w:val="Heading3"/>
       </w:pPr>
-      <w:bookmarkStart w:id="4" w:name="_Toc94192273"/>
-      <w:r>
-        <w:t>PLC Setup</w:t>
-      </w:r>
-      <w:bookmarkEnd w:id="4"/>
-      <w:r>
-        <w:t xml:space="preserve"> </w:t>
-      </w:r>
-    </w:p>
-    <w:p/>
-    <w:p>
-      <w:pPr>
-        <w:pStyle w:val="Heading3"/>
-      </w:pPr>
-      <w:bookmarkStart w:id="5" w:name="_Toc94192274"/>
+      <w:bookmarkStart w:id="6" w:name="_Toc94192274"/>
       <w:r>
         <w:t>Scope Setup</w:t>
       </w:r>
-      <w:bookmarkEnd w:id="5"/>
+      <w:bookmarkEnd w:id="6"/>
     </w:p>
     <w:sectPr>
       <w:pgSz w:w="12240" w:h="15840"/>
@@ -909,7 +1558,7 @@
 </file>
 
 <file path=word/numbering.xml><?xml version="1.0" encoding="utf-8"?>
-<w:numbering xmlns:wpc="http://schemas.microsoft.com/office/word/2010/wordprocessingCanvas" xmlns:cx="http://schemas.microsoft.com/office/drawing/2014/chartex" xmlns:cx1="http://schemas.microsoft.com/office/drawing/2015/9/8/chartex" xmlns:cx2="http://schemas.microsoft.com/office/drawing/2015/10/21/chartex" xmlns:cx3="http://schemas.microsoft.com/office/drawing/2016/5/9/chartex" xmlns:cx4="http://schemas.microsoft.com/office/drawing/2016/5/10/chartex" xmlns:cx5="http://schemas.microsoft.com/office/drawing/2016/5/11/chartex" xmlns:cx6="http://schemas.microsoft.com/office/drawing/2016/5/12/chartex" xmlns:cx7="http://schemas.microsoft.com/office/drawing/2016/5/13/chartex" xmlns:cx8="http://schemas.microsoft.com/office/drawing/2016/5/14/chartex" xmlns:mc="http://schemas.openxmlformats.org/markup-compatibility/2006" xmlns:aink="http://schemas.microsoft.com/office/drawing/2016/ink" xmlns:am3d="http://schemas.microsoft.com/office/drawing/2017/model3d" xmlns:o="urn:schemas-microsoft-com:office:office" xmlns:r="http://schemas.openxmlformats.org/officeDocument/2006/relationships" xmlns:m="http://schemas.openxmlformats.org/officeDocument/2006/math" xmlns:v="urn:schemas-microsoft-com:vml" xmlns:wp14="http://schemas.microsoft.com/office/word/2010/wordprocessingDrawing" xmlns:wp="http://schemas.openxmlformats.org/drawingml/2006/wordprocessingDrawing" xmlns:w10="urn:schemas-microsoft-com:office:word" xmlns:w="http://schemas.openxmlformats.org/wordprocessingml/2006/main" xmlns:w14="http://schemas.microsoft.com/office/word/2010/wordml" xmlns:w15="http://schemas.microsoft.com/office/word/2012/wordml" xmlns:w16cex="http://schemas.microsoft.com/office/word/2018/wordml/cex" xmlns:w16cid="http://schemas.microsoft.com/office/word/2016/wordml/cid" xmlns:w16="http://schemas.microsoft.com/office/word/2018/wordml" xmlns:w16sdtdh="http://schemas.microsoft.com/office/word/2020/wordml/sdtdatahash" xmlns:w16se="http://schemas.microsoft.com/office/word/2015/wordml/symex" xmlns:wpg="http://schemas.microsoft.com/office/word/2010/wordprocessingGroup" xmlns:wpi="http://schemas.microsoft.com/office/word/2010/wordprocessingInk" xmlns:wne="http://schemas.microsoft.com/office/word/2006/wordml" xmlns:wps="http://schemas.microsoft.com/office/word/2010/wordprocessingShape" mc:Ignorable="w14 w15 w16se w16cid w16 w16cex w16sdtdh wp14">
+<w:numbering xmlns:wpc="http://schemas.microsoft.com/office/word/2010/wordprocessingCanvas" xmlns:cx="http://schemas.microsoft.com/office/drawing/2014/chartex" xmlns:cx1="http://schemas.microsoft.com/office/drawing/2015/9/8/chartex" xmlns:mc="http://schemas.openxmlformats.org/markup-compatibility/2006" xmlns:o="urn:schemas-microsoft-com:office:office" xmlns:r="http://schemas.openxmlformats.org/officeDocument/2006/relationships" xmlns:m="http://schemas.openxmlformats.org/officeDocument/2006/math" xmlns:v="urn:schemas-microsoft-com:vml" xmlns:wp14="http://schemas.microsoft.com/office/word/2010/wordprocessingDrawing" xmlns:wp="http://schemas.openxmlformats.org/drawingml/2006/wordprocessingDrawing" xmlns:w10="urn:schemas-microsoft-com:office:word" xmlns:w="http://schemas.openxmlformats.org/wordprocessingml/2006/main" xmlns:w14="http://schemas.microsoft.com/office/word/2010/wordml" xmlns:w15="http://schemas.microsoft.com/office/word/2012/wordml" xmlns:w16se="http://schemas.microsoft.com/office/word/2015/wordml/symex" xmlns:wpg="http://schemas.microsoft.com/office/word/2010/wordprocessingGroup" xmlns:wpi="http://schemas.microsoft.com/office/word/2010/wordprocessingInk" xmlns:wne="http://schemas.microsoft.com/office/word/2006/wordml" xmlns:wps="http://schemas.microsoft.com/office/word/2010/wordprocessingShape" mc:Ignorable="w14 w15 w16se wp14">
   <w:abstractNum w:abstractNumId="0" w15:restartNumberingAfterBreak="0">
     <w:nsid w:val="18360117"/>
     <w:multiLevelType w:val="hybridMultilevel"/>
@@ -1190,7 +1839,7 @@
 </file>
 
 <file path=word/styles.xml><?xml version="1.0" encoding="utf-8"?>
-<w:styles xmlns:mc="http://schemas.openxmlformats.org/markup-compatibility/2006" xmlns:r="http://schemas.openxmlformats.org/officeDocument/2006/relationships" xmlns:w="http://schemas.openxmlformats.org/wordprocessingml/2006/main" xmlns:w14="http://schemas.microsoft.com/office/word/2010/wordml" xmlns:w15="http://schemas.microsoft.com/office/word/2012/wordml" xmlns:w16cex="http://schemas.microsoft.com/office/word/2018/wordml/cex" xmlns:w16cid="http://schemas.microsoft.com/office/word/2016/wordml/cid" xmlns:w16="http://schemas.microsoft.com/office/word/2018/wordml" xmlns:w16sdtdh="http://schemas.microsoft.com/office/word/2020/wordml/sdtdatahash" xmlns:w16se="http://schemas.microsoft.com/office/word/2015/wordml/symex" mc:Ignorable="w14 w15 w16se w16cid w16 w16cex w16sdtdh">
+<w:styles xmlns:mc="http://schemas.openxmlformats.org/markup-compatibility/2006" xmlns:r="http://schemas.openxmlformats.org/officeDocument/2006/relationships" xmlns:w="http://schemas.openxmlformats.org/wordprocessingml/2006/main" xmlns:w14="http://schemas.microsoft.com/office/word/2010/wordml" xmlns:w15="http://schemas.microsoft.com/office/word/2012/wordml" xmlns:w16se="http://schemas.microsoft.com/office/word/2015/wordml/symex" mc:Ignorable="w14 w15 w16se">
   <w:docDefaults>
     <w:rPrDefault>
       <w:rPr>
@@ -1206,7 +1855,7 @@
       </w:pPr>
     </w:pPrDefault>
   </w:docDefaults>
-  <w:latentStyles w:defLockedState="0" w:defUIPriority="99" w:defSemiHidden="0" w:defUnhideWhenUsed="0" w:defQFormat="0" w:count="376">
+  <w:latentStyles w:defLockedState="0" w:defUIPriority="99" w:defSemiHidden="0" w:defUnhideWhenUsed="0" w:defQFormat="0" w:count="371">
     <w:lsdException w:name="Normal" w:uiPriority="0" w:qFormat="1"/>
     <w:lsdException w:name="heading 1" w:uiPriority="9" w:qFormat="1"/>
     <w:lsdException w:name="heading 2" w:semiHidden="1" w:uiPriority="9" w:unhideWhenUsed="1" w:qFormat="1"/>
@@ -1578,11 +2227,6 @@
     <w:lsdException w:name="List Table 5 Dark Accent 6" w:uiPriority="50"/>
     <w:lsdException w:name="List Table 6 Colorful Accent 6" w:uiPriority="51"/>
     <w:lsdException w:name="List Table 7 Colorful Accent 6" w:uiPriority="52"/>
-    <w:lsdException w:name="Mention" w:semiHidden="1" w:unhideWhenUsed="1"/>
-    <w:lsdException w:name="Smart Hyperlink" w:semiHidden="1" w:unhideWhenUsed="1"/>
-    <w:lsdException w:name="Hashtag" w:semiHidden="1" w:unhideWhenUsed="1"/>
-    <w:lsdException w:name="Unresolved Mention" w:semiHidden="1" w:unhideWhenUsed="1"/>
-    <w:lsdException w:name="Smart Link" w:semiHidden="1" w:unhideWhenUsed="1"/>
   </w:latentStyles>
   <w:style w:type="paragraph" w:default="1" w:styleId="Normal">
     <w:name w:val="Normal"/>
@@ -1651,6 +2295,48 @@
       <w:color w:val="1F4D78" w:themeColor="accent1" w:themeShade="7F"/>
       <w:sz w:val="24"/>
       <w:szCs w:val="24"/>
+    </w:rPr>
+  </w:style>
+  <w:style w:type="paragraph" w:styleId="Heading4">
+    <w:name w:val="heading 4"/>
+    <w:basedOn w:val="Normal"/>
+    <w:next w:val="Normal"/>
+    <w:link w:val="Heading4Char"/>
+    <w:uiPriority w:val="9"/>
+    <w:unhideWhenUsed/>
+    <w:qFormat/>
+    <w:rsid w:val="0042723D"/>
+    <w:pPr>
+      <w:keepNext/>
+      <w:keepLines/>
+      <w:spacing w:before="40" w:after="0"/>
+      <w:outlineLvl w:val="3"/>
+    </w:pPr>
+    <w:rPr>
+      <w:rFonts w:asciiTheme="majorHAnsi" w:eastAsiaTheme="majorEastAsia" w:hAnsiTheme="majorHAnsi" w:cstheme="majorBidi"/>
+      <w:i/>
+      <w:iCs/>
+      <w:color w:val="2E74B5" w:themeColor="accent1" w:themeShade="BF"/>
+    </w:rPr>
+  </w:style>
+  <w:style w:type="paragraph" w:styleId="Heading5">
+    <w:name w:val="heading 5"/>
+    <w:basedOn w:val="Normal"/>
+    <w:next w:val="Normal"/>
+    <w:link w:val="Heading5Char"/>
+    <w:uiPriority w:val="9"/>
+    <w:unhideWhenUsed/>
+    <w:qFormat/>
+    <w:rsid w:val="00CA2E7B"/>
+    <w:pPr>
+      <w:keepNext/>
+      <w:keepLines/>
+      <w:spacing w:before="40" w:after="0"/>
+      <w:outlineLvl w:val="4"/>
+    </w:pPr>
+    <w:rPr>
+      <w:rFonts w:asciiTheme="majorHAnsi" w:eastAsiaTheme="majorEastAsia" w:hAnsiTheme="majorHAnsi" w:cstheme="majorBidi"/>
+      <w:color w:val="2E74B5" w:themeColor="accent1" w:themeShade="BF"/>
     </w:rPr>
   </w:style>
   <w:style w:type="character" w:default="1" w:styleId="DefaultParagraphFont">
@@ -1797,6 +2483,30 @@
       <w:spacing w:after="100"/>
       <w:ind w:left="440"/>
     </w:pPr>
+  </w:style>
+  <w:style w:type="character" w:customStyle="1" w:styleId="Heading4Char">
+    <w:name w:val="Heading 4 Char"/>
+    <w:basedOn w:val="DefaultParagraphFont"/>
+    <w:link w:val="Heading4"/>
+    <w:uiPriority w:val="9"/>
+    <w:rsid w:val="0042723D"/>
+    <w:rPr>
+      <w:rFonts w:asciiTheme="majorHAnsi" w:eastAsiaTheme="majorEastAsia" w:hAnsiTheme="majorHAnsi" w:cstheme="majorBidi"/>
+      <w:i/>
+      <w:iCs/>
+      <w:color w:val="2E74B5" w:themeColor="accent1" w:themeShade="BF"/>
+    </w:rPr>
+  </w:style>
+  <w:style w:type="character" w:customStyle="1" w:styleId="Heading5Char">
+    <w:name w:val="Heading 5 Char"/>
+    <w:basedOn w:val="DefaultParagraphFont"/>
+    <w:link w:val="Heading5"/>
+    <w:uiPriority w:val="9"/>
+    <w:rsid w:val="00CA2E7B"/>
+    <w:rPr>
+      <w:rFonts w:asciiTheme="majorHAnsi" w:eastAsiaTheme="majorEastAsia" w:hAnsiTheme="majorHAnsi" w:cstheme="majorBidi"/>
+      <w:color w:val="2E74B5" w:themeColor="accent1" w:themeShade="BF"/>
+    </w:rPr>
   </w:style>
 </w:styles>
 </file>
@@ -2069,10 +2779,6 @@
 </file>
 
 <file path=customXml/item2.xml><?xml version="1.0" encoding="utf-8"?>
-<b:Sources xmlns:b="http://schemas.openxmlformats.org/officeDocument/2006/bibliography" xmlns="http://schemas.openxmlformats.org/officeDocument/2006/bibliography" SelectedStyle="\APASixthEditionOfficeOnline.xsl" StyleName="APA" Version="6"/>
-</file>
-
-<file path=customXml/item3.xml><?xml version="1.0" encoding="utf-8"?>
 <?mso-contentType ?>
 <FormTemplates xmlns="http://schemas.microsoft.com/sharepoint/v3/contenttype/forms">
   <Display>DocumentLibraryForm</Display>
@@ -2081,7 +2787,7 @@
 </FormTemplates>
 </file>
 
-<file path=customXml/item4.xml><?xml version="1.0" encoding="utf-8"?>
+<file path=customXml/item3.xml><?xml version="1.0" encoding="utf-8"?>
 <ct:contentTypeSchema xmlns:ct="http://schemas.microsoft.com/office/2006/metadata/contentType" xmlns:ma="http://schemas.microsoft.com/office/2006/metadata/properties/metaAttributes" ct:_="" ma:_="" ma:contentTypeName="Document" ma:contentTypeID="0x010100EE6E5C1C5B7B974290FEB10D1DCD8D31" ma:contentTypeVersion="12" ma:contentTypeDescription="Create a new document." ma:contentTypeScope="" ma:versionID="78699b2bd89bf2845925dba2fad9cd5f">
   <xsd:schema xmlns:xsd="http://www.w3.org/2001/XMLSchema" xmlns:xs="http://www.w3.org/2001/XMLSchema" xmlns:p="http://schemas.microsoft.com/office/2006/metadata/properties" xmlns:ns2="c69c2809-a790-48a5-85c4-6c52d07a2bbc" xmlns:ns3="302a1acb-8782-4a7a-ac83-47184c60ed90" targetNamespace="http://schemas.microsoft.com/office/2006/metadata/properties" ma:root="true" ma:fieldsID="7016652cebf24c8fab966be4d9fc64bd" ns2:_="" ns3:_="">
     <xsd:import namespace="c69c2809-a790-48a5-85c4-6c52d07a2bbc"/>
@@ -2298,6 +3004,10 @@
 </ct:contentTypeSchema>
 </file>
 
+<file path=customXml/item4.xml><?xml version="1.0" encoding="utf-8"?>
+<b:Sources xmlns:b="http://schemas.openxmlformats.org/officeDocument/2006/bibliography" xmlns="http://schemas.openxmlformats.org/officeDocument/2006/bibliography" SelectedStyle="\APASixthEditionOfficeOnline.xsl" StyleName="APA" Version="6"/>
+</file>
+
 <file path=customXml/itemProps1.xml><?xml version="1.0" encoding="utf-8"?>
 <ds:datastoreItem xmlns:ds="http://schemas.openxmlformats.org/officeDocument/2006/customXml" ds:itemID="{1BC7191A-1CC0-4233-8666-F5564399F7F1}">
   <ds:schemaRefs>
@@ -2308,14 +3018,6 @@
 </file>
 
 <file path=customXml/itemProps2.xml><?xml version="1.0" encoding="utf-8"?>
-<ds:datastoreItem xmlns:ds="http://schemas.openxmlformats.org/officeDocument/2006/customXml" ds:itemID="{DEAA1C43-CD60-487F-ACAF-54F186CB0593}">
-  <ds:schemaRefs>
-    <ds:schemaRef ds:uri="http://schemas.openxmlformats.org/officeDocument/2006/bibliography"/>
-  </ds:schemaRefs>
-</ds:datastoreItem>
-</file>
-
-<file path=customXml/itemProps3.xml><?xml version="1.0" encoding="utf-8"?>
 <ds:datastoreItem xmlns:ds="http://schemas.openxmlformats.org/officeDocument/2006/customXml" ds:itemID="{6D958086-F2B3-47C3-8FF6-E5FE965A77C1}">
   <ds:schemaRefs>
     <ds:schemaRef ds:uri="http://schemas.microsoft.com/sharepoint/v3/contenttype/forms"/>
@@ -2323,7 +3025,7 @@
 </ds:datastoreItem>
 </file>
 
-<file path=customXml/itemProps4.xml><?xml version="1.0" encoding="utf-8"?>
+<file path=customXml/itemProps3.xml><?xml version="1.0" encoding="utf-8"?>
 <ds:datastoreItem xmlns:ds="http://schemas.openxmlformats.org/officeDocument/2006/customXml" ds:itemID="{C7A87FEE-1A31-4CC1-9604-C506A491127C}">
   <ds:schemaRefs>
     <ds:schemaRef ds:uri="http://schemas.microsoft.com/office/2006/metadata/contentType"/>
@@ -2340,4 +3042,12 @@
     <ds:schemaRef ds:uri="http://schemas.microsoft.com/internal/obd"/>
   </ds:schemaRefs>
 </ds:datastoreItem>
+</file>
+
+<file path=customXml/itemProps4.xml><?xml version="1.0" encoding="utf-8"?>
+<ds:datastoreItem xmlns:ds="http://schemas.openxmlformats.org/officeDocument/2006/customXml" ds:itemID="{E5278275-8A00-4F6E-B3EF-78780E0703D4}">
+  <ds:schemaRefs>
+    <ds:schemaRef ds:uri="http://schemas.openxmlformats.org/officeDocument/2006/bibliography"/>
+  </ds:schemaRefs>
+</ds:datastoreItem>
 </file>
</xml_diff>

<commit_message>
Worked a bit in the README doc, had to change core assignments.
</commit_message>
<xml_diff>
--- a/VideoPlaybackSupportFiles/README - Project Setup Notes.docx
+++ b/VideoPlaybackSupportFiles/README - Project Setup Notes.docx
@@ -76,7 +76,7 @@
           <w:r>
             <w:fldChar w:fldCharType="separate"/>
           </w:r>
-          <w:hyperlink w:anchor="_Toc94192269" w:history="1">
+          <w:hyperlink w:anchor="_Toc94858844" w:history="1">
             <w:r>
               <w:rPr>
                 <w:rStyle w:val="Hyperlink"/>
@@ -103,7 +103,7 @@
                 <w:noProof/>
                 <w:webHidden/>
               </w:rPr>
-              <w:instrText xml:space="preserve"> PAGEREF _Toc94192269 \h </w:instrText>
+              <w:instrText xml:space="preserve"> PAGEREF _Toc94858844 \h </w:instrText>
             </w:r>
             <w:r>
               <w:rPr>
@@ -145,7 +145,7 @@
               <w:noProof/>
             </w:rPr>
           </w:pPr>
-          <w:hyperlink w:anchor="_Toc94192270" w:history="1">
+          <w:hyperlink w:anchor="_Toc94858845" w:history="1">
             <w:r>
               <w:rPr>
                 <w:rStyle w:val="Hyperlink"/>
@@ -172,7 +172,7 @@
                 <w:noProof/>
                 <w:webHidden/>
               </w:rPr>
-              <w:instrText xml:space="preserve"> PAGEREF _Toc94192270 \h </w:instrText>
+              <w:instrText xml:space="preserve"> PAGEREF _Toc94858845 \h </w:instrText>
             </w:r>
             <w:r>
               <w:rPr>
@@ -193,6 +193,75 @@
                 <w:webHidden/>
               </w:rPr>
               <w:t>1</w:t>
+            </w:r>
+            <w:r>
+              <w:rPr>
+                <w:noProof/>
+                <w:webHidden/>
+              </w:rPr>
+              <w:fldChar w:fldCharType="end"/>
+            </w:r>
+          </w:hyperlink>
+        </w:p>
+        <w:p>
+          <w:pPr>
+            <w:pStyle w:val="TOC3"/>
+            <w:tabs>
+              <w:tab w:val="right" w:leader="dot" w:pos="9350"/>
+            </w:tabs>
+            <w:rPr>
+              <w:rFonts w:eastAsiaTheme="minorEastAsia"/>
+              <w:noProof/>
+            </w:rPr>
+          </w:pPr>
+          <w:hyperlink w:anchor="_Toc94858846" w:history="1">
+            <w:r>
+              <w:rPr>
+                <w:rStyle w:val="Hyperlink"/>
+                <w:noProof/>
+              </w:rPr>
+              <w:t>Getting Streams Running</w:t>
+            </w:r>
+            <w:r>
+              <w:rPr>
+                <w:noProof/>
+                <w:webHidden/>
+              </w:rPr>
+              <w:tab/>
+            </w:r>
+            <w:r>
+              <w:rPr>
+                <w:noProof/>
+                <w:webHidden/>
+              </w:rPr>
+              <w:fldChar w:fldCharType="begin"/>
+            </w:r>
+            <w:r>
+              <w:rPr>
+                <w:noProof/>
+                <w:webHidden/>
+              </w:rPr>
+              <w:instrText xml:space="preserve"> PAGEREF _Toc94858846 \h </w:instrText>
+            </w:r>
+            <w:r>
+              <w:rPr>
+                <w:noProof/>
+                <w:webHidden/>
+              </w:rPr>
+            </w:r>
+            <w:r>
+              <w:rPr>
+                <w:noProof/>
+                <w:webHidden/>
+              </w:rPr>
+              <w:fldChar w:fldCharType="separate"/>
+            </w:r>
+            <w:r>
+              <w:rPr>
+                <w:noProof/>
+                <w:webHidden/>
+              </w:rPr>
+              <w:t>2</w:t>
             </w:r>
             <w:r>
               <w:rPr>
@@ -214,13 +283,13 @@
               <w:noProof/>
             </w:rPr>
           </w:pPr>
-          <w:hyperlink w:anchor="_Toc94192271" w:history="1">
+          <w:hyperlink w:anchor="_Toc94858847" w:history="1">
             <w:r>
               <w:rPr>
                 <w:rStyle w:val="Hyperlink"/>
                 <w:noProof/>
               </w:rPr>
-              <w:t>Section B – Setting up files and file paths needed for video playback functionality</w:t>
+              <w:t>Section B – Setting up Scope for AutoStart</w:t>
             </w:r>
             <w:r>
               <w:rPr>
@@ -241,7 +310,7 @@
                 <w:noProof/>
                 <w:webHidden/>
               </w:rPr>
-              <w:instrText xml:space="preserve"> PAGEREF _Toc94192271 \h </w:instrText>
+              <w:instrText xml:space="preserve"> PAGEREF _Toc94858847 \h </w:instrText>
             </w:r>
             <w:r>
               <w:rPr>
@@ -261,7 +330,76 @@
                 <w:noProof/>
                 <w:webHidden/>
               </w:rPr>
-              <w:t>2</w:t>
+              <w:t>3</w:t>
+            </w:r>
+            <w:r>
+              <w:rPr>
+                <w:noProof/>
+                <w:webHidden/>
+              </w:rPr>
+              <w:fldChar w:fldCharType="end"/>
+            </w:r>
+          </w:hyperlink>
+        </w:p>
+        <w:p>
+          <w:pPr>
+            <w:pStyle w:val="TOC2"/>
+            <w:tabs>
+              <w:tab w:val="right" w:leader="dot" w:pos="9350"/>
+            </w:tabs>
+            <w:rPr>
+              <w:rFonts w:eastAsiaTheme="minorEastAsia"/>
+              <w:noProof/>
+            </w:rPr>
+          </w:pPr>
+          <w:hyperlink w:anchor="_Toc94858848" w:history="1">
+            <w:r>
+              <w:rPr>
+                <w:rStyle w:val="Hyperlink"/>
+                <w:noProof/>
+              </w:rPr>
+              <w:t>Section C – Setting up files and file paths needed for video playback functionality</w:t>
+            </w:r>
+            <w:r>
+              <w:rPr>
+                <w:noProof/>
+                <w:webHidden/>
+              </w:rPr>
+              <w:tab/>
+            </w:r>
+            <w:r>
+              <w:rPr>
+                <w:noProof/>
+                <w:webHidden/>
+              </w:rPr>
+              <w:fldChar w:fldCharType="begin"/>
+            </w:r>
+            <w:r>
+              <w:rPr>
+                <w:noProof/>
+                <w:webHidden/>
+              </w:rPr>
+              <w:instrText xml:space="preserve"> PAGEREF _Toc94858848 \h </w:instrText>
+            </w:r>
+            <w:r>
+              <w:rPr>
+                <w:noProof/>
+                <w:webHidden/>
+              </w:rPr>
+            </w:r>
+            <w:r>
+              <w:rPr>
+                <w:noProof/>
+                <w:webHidden/>
+              </w:rPr>
+              <w:fldChar w:fldCharType="separate"/>
+            </w:r>
+            <w:r>
+              <w:rPr>
+                <w:noProof/>
+                <w:webHidden/>
+              </w:rPr>
+              <w:t>3</w:t>
             </w:r>
             <w:r>
               <w:rPr>
@@ -279,10 +417,11 @@
               <w:tab w:val="right" w:leader="dot" w:pos="9350"/>
             </w:tabs>
             <w:rPr>
+              <w:rFonts w:eastAsiaTheme="minorEastAsia"/>
               <w:noProof/>
             </w:rPr>
           </w:pPr>
-          <w:hyperlink w:anchor="_Toc94192272" w:history="1">
+          <w:hyperlink w:anchor="_Toc94858849" w:history="1">
             <w:r>
               <w:rPr>
                 <w:rStyle w:val="Hyperlink"/>
@@ -309,7 +448,7 @@
                 <w:noProof/>
                 <w:webHidden/>
               </w:rPr>
-              <w:instrText xml:space="preserve"> PAGEREF _Toc94192272 \h </w:instrText>
+              <w:instrText xml:space="preserve"> PAGEREF _Toc94858849 \h </w:instrText>
             </w:r>
             <w:r>
               <w:rPr>
@@ -329,7 +468,7 @@
                 <w:noProof/>
                 <w:webHidden/>
               </w:rPr>
-              <w:t>2</w:t>
+              <w:t>4</w:t>
             </w:r>
             <w:r>
               <w:rPr>
@@ -347,10 +486,11 @@
               <w:tab w:val="right" w:leader="dot" w:pos="9350"/>
             </w:tabs>
             <w:rPr>
+              <w:rFonts w:eastAsiaTheme="minorEastAsia"/>
               <w:noProof/>
             </w:rPr>
           </w:pPr>
-          <w:hyperlink w:anchor="_Toc94192273" w:history="1">
+          <w:hyperlink w:anchor="_Toc94858850" w:history="1">
             <w:r>
               <w:rPr>
                 <w:rStyle w:val="Hyperlink"/>
@@ -377,7 +517,7 @@
                 <w:noProof/>
                 <w:webHidden/>
               </w:rPr>
-              <w:instrText xml:space="preserve"> PAGEREF _Toc94192273 \h </w:instrText>
+              <w:instrText xml:space="preserve"> PAGEREF _Toc94858850 \h </w:instrText>
             </w:r>
             <w:r>
               <w:rPr>
@@ -397,7 +537,7 @@
                 <w:noProof/>
                 <w:webHidden/>
               </w:rPr>
-              <w:t>2</w:t>
+              <w:t>4</w:t>
             </w:r>
             <w:r>
               <w:rPr>
@@ -415,10 +555,11 @@
               <w:tab w:val="right" w:leader="dot" w:pos="9350"/>
             </w:tabs>
             <w:rPr>
+              <w:rFonts w:eastAsiaTheme="minorEastAsia"/>
               <w:noProof/>
             </w:rPr>
           </w:pPr>
-          <w:hyperlink w:anchor="_Toc94192274" w:history="1">
+          <w:hyperlink w:anchor="_Toc94858851" w:history="1">
             <w:r>
               <w:rPr>
                 <w:rStyle w:val="Hyperlink"/>
@@ -445,7 +586,7 @@
                 <w:noProof/>
                 <w:webHidden/>
               </w:rPr>
-              <w:instrText xml:space="preserve"> PAGEREF _Toc94192274 \h </w:instrText>
+              <w:instrText xml:space="preserve"> PAGEREF _Toc94858851 \h </w:instrText>
             </w:r>
             <w:r>
               <w:rPr>
@@ -465,7 +606,7 @@
                 <w:noProof/>
                 <w:webHidden/>
               </w:rPr>
-              <w:t>2</w:t>
+              <w:t>4</w:t>
             </w:r>
             <w:r>
               <w:rPr>
@@ -497,7 +638,7 @@
       <w:pPr>
         <w:pStyle w:val="Heading2"/>
       </w:pPr>
-      <w:bookmarkStart w:id="0" w:name="_Toc94192269"/>
+      <w:bookmarkStart w:id="0" w:name="_Toc94858844"/>
       <w:r>
         <w:t>Install Requirements</w:t>
       </w:r>
@@ -536,7 +677,7 @@
       <w:pPr>
         <w:pStyle w:val="Heading2"/>
       </w:pPr>
-      <w:bookmarkStart w:id="1" w:name="_Toc94192270"/>
+      <w:bookmarkStart w:id="1" w:name="_Toc94858845"/>
       <w:r>
         <w:t>Section A</w:t>
       </w:r>
@@ -571,7 +712,22 @@
     </w:p>
     <w:p>
       <w:r>
-        <w:t>If changing location, will need to change in 2 locations:</w:t>
+        <w:t>NOTE: I</w:t>
+      </w:r>
+      <w:r>
+        <w:t>f</w:t>
+      </w:r>
+      <w:r>
+        <w:t xml:space="preserve"> pacing the Streams and contours in a different folder, then need to </w:t>
+      </w:r>
+      <w:r>
+        <w:t xml:space="preserve">change </w:t>
+      </w:r>
+      <w:r>
+        <w:t xml:space="preserve">the file path in these </w:t>
+      </w:r>
+      <w:r>
+        <w:t>2 locations:</w:t>
       </w:r>
     </w:p>
     <w:p/>
@@ -639,6 +795,7 @@
         </w:numPr>
       </w:pPr>
       <w:r>
+        <w:lastRenderedPageBreak/>
         <w:t>In Streams playback folder location</w:t>
       </w:r>
     </w:p>
@@ -650,7 +807,6 @@
         <w:rPr>
           <w:noProof/>
         </w:rPr>
-        <w:lastRenderedPageBreak/>
         <w:drawing>
           <wp:inline distT="0" distB="0" distL="0" distR="0" wp14:anchorId="4C44B1F6" wp14:editId="026BFB5E">
             <wp:extent cx="5943600" cy="2236470"/>
@@ -689,22 +845,221 @@
       </w:r>
     </w:p>
     <w:p/>
+    <w:p>
+      <w:pPr>
+        <w:pStyle w:val="Heading3"/>
+      </w:pPr>
+      <w:bookmarkStart w:id="2" w:name="_Toc94858846"/>
+      <w:r>
+        <w:t>Getting Streams Running</w:t>
+      </w:r>
+      <w:bookmarkEnd w:id="2"/>
+    </w:p>
+    <w:p>
+      <w:r>
+        <w:tab/>
+        <w:t xml:space="preserve">After successful activation of the project, we will need to start the vision stream to start sending images to PLC and Scope. </w:t>
+      </w:r>
+      <w:r>
+        <w:t>Start the stream using the steps below.</w:t>
+      </w:r>
+    </w:p>
+    <w:p>
+      <w:r>
+        <w:rPr>
+          <w:noProof/>
+        </w:rPr>
+        <w:drawing>
+          <wp:inline distT="0" distB="0" distL="0" distR="0" wp14:anchorId="3087C8A3" wp14:editId="1FE679B2">
+            <wp:extent cx="5943600" cy="3470275"/>
+            <wp:effectExtent l="0" t="0" r="0" b="0"/>
+            <wp:docPr id="3" name="Picture 3" descr="A screenshot of a computer&#10;&#10;Description automatically generated"/>
+            <wp:cNvGraphicFramePr>
+              <a:graphicFrameLocks xmlns:a="http://schemas.openxmlformats.org/drawingml/2006/main" noChangeAspect="1"/>
+            </wp:cNvGraphicFramePr>
+            <a:graphic xmlns:a="http://schemas.openxmlformats.org/drawingml/2006/main">
+              <a:graphicData uri="http://schemas.openxmlformats.org/drawingml/2006/picture">
+                <pic:pic xmlns:pic="http://schemas.openxmlformats.org/drawingml/2006/picture">
+                  <pic:nvPicPr>
+                    <pic:cNvPr id="3" name="Picture 3" descr="A screenshot of a computer&#10;&#10;Description automatically generated"/>
+                    <pic:cNvPicPr/>
+                  </pic:nvPicPr>
+                  <pic:blipFill>
+                    <a:blip r:embed="rId12"/>
+                    <a:stretch>
+                      <a:fillRect/>
+                    </a:stretch>
+                  </pic:blipFill>
+                  <pic:spPr>
+                    <a:xfrm>
+                      <a:off x="0" y="0"/>
+                      <a:ext cx="5943600" cy="3470275"/>
+                    </a:xfrm>
+                    <a:prstGeom prst="rect">
+                      <a:avLst/>
+                    </a:prstGeom>
+                  </pic:spPr>
+                </pic:pic>
+              </a:graphicData>
+            </a:graphic>
+          </wp:inline>
+        </w:drawing>
+      </w:r>
+    </w:p>
+    <w:p>
+      <w:r>
+        <w:tab/>
+      </w:r>
+    </w:p>
     <w:p/>
     <w:p>
+      <w:r>
+        <w:t xml:space="preserve">Can test </w:t>
+      </w:r>
+      <w:proofErr w:type="gramStart"/>
+      <w:r>
+        <w:t>that images</w:t>
+      </w:r>
+      <w:proofErr w:type="gramEnd"/>
+      <w:r>
+        <w:t xml:space="preserve"> are being sent from Vision application by using ADS image watch, found at pull down TwinCAT -&gt; Windows -&gt; ADS Image Watch</w:t>
+      </w:r>
+      <w:r>
+        <w:t>.</w:t>
+      </w:r>
+    </w:p>
+    <w:p/>
+    <w:p>
+      <w:r>
+        <w:rPr>
+          <w:noProof/>
+        </w:rPr>
+        <w:drawing>
+          <wp:inline distT="0" distB="0" distL="0" distR="0" wp14:anchorId="644B2C97" wp14:editId="32FA7B31">
+            <wp:extent cx="4285714" cy="4285714"/>
+            <wp:effectExtent l="0" t="0" r="635" b="635"/>
+            <wp:docPr id="4" name="Picture 4" descr="Graphical user interface, application&#10;&#10;Description automatically generated"/>
+            <wp:cNvGraphicFramePr>
+              <a:graphicFrameLocks xmlns:a="http://schemas.openxmlformats.org/drawingml/2006/main" noChangeAspect="1"/>
+            </wp:cNvGraphicFramePr>
+            <a:graphic xmlns:a="http://schemas.openxmlformats.org/drawingml/2006/main">
+              <a:graphicData uri="http://schemas.openxmlformats.org/drawingml/2006/picture">
+                <pic:pic xmlns:pic="http://schemas.openxmlformats.org/drawingml/2006/picture">
+                  <pic:nvPicPr>
+                    <pic:cNvPr id="4" name="Picture 4" descr="Graphical user interface, application&#10;&#10;Description automatically generated"/>
+                    <pic:cNvPicPr/>
+                  </pic:nvPicPr>
+                  <pic:blipFill>
+                    <a:blip r:embed="rId13"/>
+                    <a:stretch>
+                      <a:fillRect/>
+                    </a:stretch>
+                  </pic:blipFill>
+                  <pic:spPr>
+                    <a:xfrm>
+                      <a:off x="0" y="0"/>
+                      <a:ext cx="4285714" cy="4285714"/>
+                    </a:xfrm>
+                    <a:prstGeom prst="rect">
+                      <a:avLst/>
+                    </a:prstGeom>
+                  </pic:spPr>
+                </pic:pic>
+              </a:graphicData>
+            </a:graphic>
+          </wp:inline>
+        </w:drawing>
+      </w:r>
+    </w:p>
+    <w:p/>
+    <w:p/>
+    <w:p>
       <w:pPr>
         <w:pStyle w:val="Heading2"/>
       </w:pPr>
-      <w:bookmarkStart w:id="2" w:name="_Toc94192271"/>
+      <w:bookmarkStart w:id="3" w:name="_Toc94858847"/>
       <w:r>
         <w:t xml:space="preserve">Section </w:t>
       </w:r>
       <w:r>
-        <w:t xml:space="preserve">B – </w:t>
+        <w:t>B</w:t>
+      </w:r>
+      <w:r>
+        <w:t xml:space="preserve"> – Setting up </w:t>
+      </w:r>
+      <w:r>
+        <w:t>Scope for AutoStart</w:t>
+      </w:r>
+      <w:bookmarkEnd w:id="3"/>
+    </w:p>
+    <w:p>
+      <w:r>
+        <w:tab/>
+      </w:r>
+      <w:r>
+        <w:t xml:space="preserve">For scope server to run the scope project and export the images on trigger, need to place the scope configuration into the scope server </w:t>
+      </w:r>
+      <w:proofErr w:type="spellStart"/>
+      <w:r>
+        <w:t>Autostart</w:t>
+      </w:r>
+      <w:proofErr w:type="spellEnd"/>
+      <w:r>
+        <w:t xml:space="preserve"> folder. </w:t>
+      </w:r>
+    </w:p>
+    <w:p>
+      <w:r>
+        <w:t xml:space="preserve">From the solution folder / TwinCAT Measurement project, move </w:t>
+      </w:r>
+      <w:proofErr w:type="gramStart"/>
+      <w:r>
+        <w:t>the .</w:t>
+      </w:r>
+      <w:proofErr w:type="spellStart"/>
+      <w:r>
+        <w:t>tcscopex</w:t>
+      </w:r>
+      <w:proofErr w:type="spellEnd"/>
+      <w:proofErr w:type="gramEnd"/>
+      <w:r>
+        <w:t xml:space="preserve"> file into </w:t>
+      </w:r>
+      <w:r>
+        <w:t>C:\TwinCAT\Functions\TF3300-Scope-Server\Autostart Configs</w:t>
+      </w:r>
+      <w:r>
+        <w:t>.</w:t>
+      </w:r>
+    </w:p>
+    <w:p/>
+    <w:p>
+      <w:pPr>
+        <w:pStyle w:val="Heading2"/>
+      </w:pPr>
+      <w:bookmarkStart w:id="4" w:name="_Toc94858848"/>
+      <w:r>
+        <w:t xml:space="preserve">Section </w:t>
+      </w:r>
+      <w:r>
+        <w:t>C</w:t>
+      </w:r>
+      <w:r>
+        <w:t xml:space="preserve"> – </w:t>
       </w:r>
       <w:r>
         <w:t>Setting up files and file paths needed for video playback functionality</w:t>
       </w:r>
-      <w:bookmarkEnd w:id="2"/>
+      <w:bookmarkEnd w:id="4"/>
+    </w:p>
+    <w:p/>
+    <w:p>
+      <w:r>
+        <w:rPr>
+          <w:highlight w:val="yellow"/>
+        </w:rPr>
+        <w:t>*** UNDER CONSTRUCTION ***</w:t>
+      </w:r>
     </w:p>
     <w:p/>
     <w:p>
@@ -733,6 +1088,7 @@
               <w:jc w:val="center"/>
             </w:pPr>
             <w:r>
+              <w:lastRenderedPageBreak/>
               <w:t>Alias used in this Doc</w:t>
             </w:r>
           </w:p>
@@ -754,6 +1110,103 @@
           <w:tcPr>
             <w:tcW w:w="3117" w:type="dxa"/>
           </w:tcPr>
+          <w:p>
+            <w:r>
+              <w:t xml:space="preserve">Locations </w:t>
+            </w:r>
+            <w:r>
+              <w:t>that paths will need set</w:t>
+            </w:r>
+          </w:p>
+        </w:tc>
+      </w:tr>
+      <w:tr>
+        <w:tc>
+          <w:tcPr>
+            <w:tcW w:w="3116" w:type="dxa"/>
+          </w:tcPr>
+          <w:p>
+            <w:pPr>
+              <w:jc w:val="center"/>
+            </w:pPr>
+            <w:r>
+              <w:t>&lt;</w:t>
+            </w:r>
+            <w:proofErr w:type="spellStart"/>
+            <w:r>
+              <w:t>VideoPath</w:t>
+            </w:r>
+            <w:proofErr w:type="spellEnd"/>
+            <w:r>
+              <w:t>&gt;</w:t>
+            </w:r>
+          </w:p>
+        </w:tc>
+        <w:tc>
+          <w:tcPr>
+            <w:tcW w:w="3117" w:type="dxa"/>
+          </w:tcPr>
+          <w:p>
+            <w:r>
+              <w:t xml:space="preserve"> Location destination for created video file</w:t>
+            </w:r>
+          </w:p>
+        </w:tc>
+        <w:tc>
+          <w:tcPr>
+            <w:tcW w:w="3117" w:type="dxa"/>
+          </w:tcPr>
+          <w:p>
+            <w:r>
+              <w:rPr>
+                <w:b/>
+                <w:bCs/>
+              </w:rPr>
+              <w:t>PLC</w:t>
+            </w:r>
+            <w:r>
+              <w:t xml:space="preserve"> – </w:t>
+            </w:r>
+            <w:proofErr w:type="spellStart"/>
+            <w:r>
+              <w:t>VideoDestinationPath</w:t>
+            </w:r>
+            <w:proofErr w:type="spellEnd"/>
+            <w:r>
+              <w:t xml:space="preserve"> in FB </w:t>
+            </w:r>
+            <w:proofErr w:type="spellStart"/>
+            <w:r>
+              <w:t>ScopeRecordTestCode</w:t>
+            </w:r>
+            <w:proofErr w:type="spellEnd"/>
+          </w:p>
+          <w:p/>
+          <w:p>
+            <w:r>
+              <w:rPr>
+                <w:b/>
+                <w:bCs/>
+              </w:rPr>
+              <w:t>Scope</w:t>
+            </w:r>
+            <w:r>
+              <w:t xml:space="preserve"> – </w:t>
+            </w:r>
+          </w:p>
+          <w:p/>
+          <w:p>
+            <w:r>
+              <w:rPr>
+                <w:b/>
+                <w:bCs/>
+              </w:rPr>
+              <w:t>HMI</w:t>
+            </w:r>
+            <w:r>
+              <w:t xml:space="preserve"> - Virtual Directories</w:t>
+            </w:r>
+          </w:p>
           <w:p/>
         </w:tc>
       </w:tr>
@@ -771,7 +1224,7 @@
             </w:r>
             <w:proofErr w:type="spellStart"/>
             <w:r>
-              <w:t>VideoPath</w:t>
+              <w:t>ScopeImageExportPath</w:t>
             </w:r>
             <w:proofErr w:type="spellEnd"/>
             <w:r>
@@ -783,34 +1236,9 @@
           <w:tcPr>
             <w:tcW w:w="3117" w:type="dxa"/>
           </w:tcPr>
-          <w:p/>
-        </w:tc>
-        <w:tc>
-          <w:tcPr>
-            <w:tcW w:w="3117" w:type="dxa"/>
-          </w:tcPr>
-          <w:p/>
-        </w:tc>
-      </w:tr>
-      <w:tr>
-        <w:tc>
-          <w:tcPr>
-            <w:tcW w:w="3116" w:type="dxa"/>
-          </w:tcPr>
           <w:p>
-            <w:pPr>
-              <w:jc w:val="center"/>
-            </w:pPr>
-            <w:r>
-              <w:t>&lt;</w:t>
-            </w:r>
-            <w:proofErr w:type="spellStart"/>
-            <w:r>
-              <w:t>ScopeImageExportPath</w:t>
-            </w:r>
-            <w:proofErr w:type="spellEnd"/>
-            <w:r>
-              <w:t>&gt;</w:t>
+            <w:r>
+              <w:t>Location scope will export the images</w:t>
             </w:r>
           </w:p>
         </w:tc>
@@ -818,13 +1246,31 @@
           <w:tcPr>
             <w:tcW w:w="3117" w:type="dxa"/>
           </w:tcPr>
-          <w:p/>
-        </w:tc>
-        <w:tc>
-          <w:tcPr>
-            <w:tcW w:w="3117" w:type="dxa"/>
-          </w:tcPr>
-          <w:p/>
+          <w:p>
+            <w:proofErr w:type="gramStart"/>
+            <w:r>
+              <w:rPr>
+                <w:b/>
+                <w:bCs/>
+              </w:rPr>
+              <w:t>PLC</w:t>
+            </w:r>
+            <w:r>
+              <w:t xml:space="preserve">  -</w:t>
+            </w:r>
+            <w:proofErr w:type="gramEnd"/>
+            <w:r>
+              <w:t xml:space="preserve"> </w:t>
+            </w:r>
+            <w:proofErr w:type="spellStart"/>
+            <w:r>
+              <w:t>ScopeImageExportPath</w:t>
+            </w:r>
+            <w:proofErr w:type="spellEnd"/>
+            <w:r>
+              <w:t xml:space="preserve"> in </w:t>
+            </w:r>
+          </w:p>
         </w:tc>
       </w:tr>
       <w:tr>
@@ -857,11 +1303,11 @@
       <w:pPr>
         <w:pStyle w:val="Heading3"/>
       </w:pPr>
-      <w:bookmarkStart w:id="3" w:name="_Toc94192272"/>
+      <w:bookmarkStart w:id="5" w:name="_Toc94858849"/>
       <w:r>
         <w:t>HMI Setup</w:t>
       </w:r>
-      <w:bookmarkEnd w:id="3"/>
+      <w:bookmarkEnd w:id="5"/>
     </w:p>
     <w:p>
       <w:r>
@@ -878,11 +1324,11 @@
       <w:pPr>
         <w:pStyle w:val="Heading3"/>
       </w:pPr>
-      <w:bookmarkStart w:id="4" w:name="_Toc94192273"/>
+      <w:bookmarkStart w:id="6" w:name="_Toc94858850"/>
       <w:r>
         <w:t>PLC Setup</w:t>
       </w:r>
-      <w:bookmarkEnd w:id="4"/>
+      <w:bookmarkEnd w:id="6"/>
       <w:r>
         <w:t xml:space="preserve"> </w:t>
       </w:r>
@@ -892,11 +1338,11 @@
       <w:pPr>
         <w:pStyle w:val="Heading3"/>
       </w:pPr>
-      <w:bookmarkStart w:id="5" w:name="_Toc94192274"/>
+      <w:bookmarkStart w:id="7" w:name="_Toc94858851"/>
       <w:r>
         <w:t>Scope Setup</w:t>
       </w:r>
-      <w:bookmarkEnd w:id="5"/>
+      <w:bookmarkEnd w:id="7"/>
     </w:p>
     <w:sectPr>
       <w:pgSz w:w="12240" w:h="15840"/>
@@ -2063,25 +2509,6 @@
 </file>
 
 <file path=customXml/item1.xml><?xml version="1.0" encoding="utf-8"?>
-<p:properties xmlns:p="http://schemas.microsoft.com/office/2006/metadata/properties" xmlns:xsi="http://www.w3.org/2001/XMLSchema-instance" xmlns:pc="http://schemas.microsoft.com/office/infopath/2007/PartnerControls">
-  <documentManagement/>
-</p:properties>
-</file>
-
-<file path=customXml/item2.xml><?xml version="1.0" encoding="utf-8"?>
-<b:Sources xmlns:b="http://schemas.openxmlformats.org/officeDocument/2006/bibliography" xmlns="http://schemas.openxmlformats.org/officeDocument/2006/bibliography" SelectedStyle="\APASixthEditionOfficeOnline.xsl" StyleName="APA" Version="6"/>
-</file>
-
-<file path=customXml/item3.xml><?xml version="1.0" encoding="utf-8"?>
-<?mso-contentType ?>
-<FormTemplates xmlns="http://schemas.microsoft.com/sharepoint/v3/contenttype/forms">
-  <Display>DocumentLibraryForm</Display>
-  <Edit>DocumentLibraryForm</Edit>
-  <New>DocumentLibraryForm</New>
-</FormTemplates>
-</file>
-
-<file path=customXml/item4.xml><?xml version="1.0" encoding="utf-8"?>
 <ct:contentTypeSchema xmlns:ct="http://schemas.microsoft.com/office/2006/metadata/contentType" xmlns:ma="http://schemas.microsoft.com/office/2006/metadata/properties/metaAttributes" ct:_="" ma:_="" ma:contentTypeName="Document" ma:contentTypeID="0x010100EE6E5C1C5B7B974290FEB10D1DCD8D31" ma:contentTypeVersion="12" ma:contentTypeDescription="Create a new document." ma:contentTypeScope="" ma:versionID="78699b2bd89bf2845925dba2fad9cd5f">
   <xsd:schema xmlns:xsd="http://www.w3.org/2001/XMLSchema" xmlns:xs="http://www.w3.org/2001/XMLSchema" xmlns:p="http://schemas.microsoft.com/office/2006/metadata/properties" xmlns:ns2="c69c2809-a790-48a5-85c4-6c52d07a2bbc" xmlns:ns3="302a1acb-8782-4a7a-ac83-47184c60ed90" targetNamespace="http://schemas.microsoft.com/office/2006/metadata/properties" ma:root="true" ma:fieldsID="7016652cebf24c8fab966be4d9fc64bd" ns2:_="" ns3:_="">
     <xsd:import namespace="c69c2809-a790-48a5-85c4-6c52d07a2bbc"/>
@@ -2298,32 +2725,26 @@
 </ct:contentTypeSchema>
 </file>
 
-<file path=customXml/itemProps1.xml><?xml version="1.0" encoding="utf-8"?>
-<ds:datastoreItem xmlns:ds="http://schemas.openxmlformats.org/officeDocument/2006/customXml" ds:itemID="{1BC7191A-1CC0-4233-8666-F5564399F7F1}">
-  <ds:schemaRefs>
-    <ds:schemaRef ds:uri="http://schemas.microsoft.com/office/2006/metadata/properties"/>
-    <ds:schemaRef ds:uri="http://schemas.microsoft.com/office/infopath/2007/PartnerControls"/>
-  </ds:schemaRefs>
-</ds:datastoreItem>
+<file path=customXml/item2.xml><?xml version="1.0" encoding="utf-8"?>
+<?mso-contentType ?>
+<FormTemplates xmlns="http://schemas.microsoft.com/sharepoint/v3/contenttype/forms">
+  <Display>DocumentLibraryForm</Display>
+  <Edit>DocumentLibraryForm</Edit>
+  <New>DocumentLibraryForm</New>
+</FormTemplates>
 </file>
 
-<file path=customXml/itemProps2.xml><?xml version="1.0" encoding="utf-8"?>
-<ds:datastoreItem xmlns:ds="http://schemas.openxmlformats.org/officeDocument/2006/customXml" ds:itemID="{DEAA1C43-CD60-487F-ACAF-54F186CB0593}">
-  <ds:schemaRefs>
-    <ds:schemaRef ds:uri="http://schemas.openxmlformats.org/officeDocument/2006/bibliography"/>
-  </ds:schemaRefs>
-</ds:datastoreItem>
+<file path=customXml/item3.xml><?xml version="1.0" encoding="utf-8"?>
+<b:Sources xmlns:b="http://schemas.openxmlformats.org/officeDocument/2006/bibliography" xmlns="http://schemas.openxmlformats.org/officeDocument/2006/bibliography" SelectedStyle="\APASixthEditionOfficeOnline.xsl" StyleName="APA" Version="6"/>
 </file>
 
-<file path=customXml/itemProps3.xml><?xml version="1.0" encoding="utf-8"?>
-<ds:datastoreItem xmlns:ds="http://schemas.openxmlformats.org/officeDocument/2006/customXml" ds:itemID="{6D958086-F2B3-47C3-8FF6-E5FE965A77C1}">
-  <ds:schemaRefs>
-    <ds:schemaRef ds:uri="http://schemas.microsoft.com/sharepoint/v3/contenttype/forms"/>
-  </ds:schemaRefs>
-</ds:datastoreItem>
+<file path=customXml/item4.xml><?xml version="1.0" encoding="utf-8"?>
+<p:properties xmlns:p="http://schemas.microsoft.com/office/2006/metadata/properties" xmlns:xsi="http://www.w3.org/2001/XMLSchema-instance" xmlns:pc="http://schemas.microsoft.com/office/infopath/2007/PartnerControls">
+  <documentManagement/>
+</p:properties>
 </file>
 
-<file path=customXml/itemProps4.xml><?xml version="1.0" encoding="utf-8"?>
+<file path=customXml/itemProps1.xml><?xml version="1.0" encoding="utf-8"?>
 <ds:datastoreItem xmlns:ds="http://schemas.openxmlformats.org/officeDocument/2006/customXml" ds:itemID="{C7A87FEE-1A31-4CC1-9604-C506A491127C}">
   <ds:schemaRefs>
     <ds:schemaRef ds:uri="http://schemas.microsoft.com/office/2006/metadata/contentType"/>
@@ -2340,4 +2761,29 @@
     <ds:schemaRef ds:uri="http://schemas.microsoft.com/internal/obd"/>
   </ds:schemaRefs>
 </ds:datastoreItem>
+</file>
+
+<file path=customXml/itemProps2.xml><?xml version="1.0" encoding="utf-8"?>
+<ds:datastoreItem xmlns:ds="http://schemas.openxmlformats.org/officeDocument/2006/customXml" ds:itemID="{6D958086-F2B3-47C3-8FF6-E5FE965A77C1}">
+  <ds:schemaRefs>
+    <ds:schemaRef ds:uri="http://schemas.microsoft.com/sharepoint/v3/contenttype/forms"/>
+  </ds:schemaRefs>
+</ds:datastoreItem>
+</file>
+
+<file path=customXml/itemProps3.xml><?xml version="1.0" encoding="utf-8"?>
+<ds:datastoreItem xmlns:ds="http://schemas.openxmlformats.org/officeDocument/2006/customXml" ds:itemID="{DEAA1C43-CD60-487F-ACAF-54F186CB0593}">
+  <ds:schemaRefs>
+    <ds:schemaRef ds:uri="http://schemas.openxmlformats.org/officeDocument/2006/bibliography"/>
+  </ds:schemaRefs>
+</ds:datastoreItem>
+</file>
+
+<file path=customXml/itemProps4.xml><?xml version="1.0" encoding="utf-8"?>
+<ds:datastoreItem xmlns:ds="http://schemas.openxmlformats.org/officeDocument/2006/customXml" ds:itemID="{1BC7191A-1CC0-4233-8666-F5564399F7F1}">
+  <ds:schemaRefs>
+    <ds:schemaRef ds:uri="http://schemas.microsoft.com/office/2006/metadata/properties"/>
+    <ds:schemaRef ds:uri="http://schemas.microsoft.com/office/infopath/2007/PartnerControls"/>
+  </ds:schemaRefs>
+</ds:datastoreItem>
 </file>
</xml_diff>

<commit_message>
Reverted to old build
</commit_message>
<xml_diff>
--- a/VideoPlaybackSupportFiles/README - Project Setup Notes.docx
+++ b/VideoPlaybackSupportFiles/README - Project Setup Notes.docx
@@ -1,6 +1,6 @@
 
 <file path=word/document.xml><?xml version="1.0" encoding="utf-8"?>
-<w:document xmlns:wpc="http://schemas.microsoft.com/office/word/2010/wordprocessingCanvas" xmlns:cx="http://schemas.microsoft.com/office/drawing/2014/chartex" xmlns:cx1="http://schemas.microsoft.com/office/drawing/2015/9/8/chartex" xmlns:mc="http://schemas.openxmlformats.org/markup-compatibility/2006" xmlns:o="urn:schemas-microsoft-com:office:office" xmlns:r="http://schemas.openxmlformats.org/officeDocument/2006/relationships" xmlns:m="http://schemas.openxmlformats.org/officeDocument/2006/math" xmlns:v="urn:schemas-microsoft-com:vml" xmlns:wp14="http://schemas.microsoft.com/office/word/2010/wordprocessingDrawing" xmlns:wp="http://schemas.openxmlformats.org/drawingml/2006/wordprocessingDrawing" xmlns:w10="urn:schemas-microsoft-com:office:word" xmlns:w="http://schemas.openxmlformats.org/wordprocessingml/2006/main" xmlns:w14="http://schemas.microsoft.com/office/word/2010/wordml" xmlns:w15="http://schemas.microsoft.com/office/word/2012/wordml" xmlns:w16se="http://schemas.microsoft.com/office/word/2015/wordml/symex" xmlns:wpg="http://schemas.microsoft.com/office/word/2010/wordprocessingGroup" xmlns:wpi="http://schemas.microsoft.com/office/word/2010/wordprocessingInk" xmlns:wne="http://schemas.microsoft.com/office/word/2006/wordml" xmlns:wps="http://schemas.microsoft.com/office/word/2010/wordprocessingShape" mc:Ignorable="w14 w15 w16se wp14">
+<w:document xmlns:wpc="http://schemas.microsoft.com/office/word/2010/wordprocessingCanvas" xmlns:cx="http://schemas.microsoft.com/office/drawing/2014/chartex" xmlns:cx1="http://schemas.microsoft.com/office/drawing/2015/9/8/chartex" xmlns:cx2="http://schemas.microsoft.com/office/drawing/2015/10/21/chartex" xmlns:cx3="http://schemas.microsoft.com/office/drawing/2016/5/9/chartex" xmlns:cx4="http://schemas.microsoft.com/office/drawing/2016/5/10/chartex" xmlns:cx5="http://schemas.microsoft.com/office/drawing/2016/5/11/chartex" xmlns:cx6="http://schemas.microsoft.com/office/drawing/2016/5/12/chartex" xmlns:cx7="http://schemas.microsoft.com/office/drawing/2016/5/13/chartex" xmlns:cx8="http://schemas.microsoft.com/office/drawing/2016/5/14/chartex" xmlns:mc="http://schemas.openxmlformats.org/markup-compatibility/2006" xmlns:aink="http://schemas.microsoft.com/office/drawing/2016/ink" xmlns:am3d="http://schemas.microsoft.com/office/drawing/2017/model3d" xmlns:o="urn:schemas-microsoft-com:office:office" xmlns:r="http://schemas.openxmlformats.org/officeDocument/2006/relationships" xmlns:m="http://schemas.openxmlformats.org/officeDocument/2006/math" xmlns:v="urn:schemas-microsoft-com:vml" xmlns:wp14="http://schemas.microsoft.com/office/word/2010/wordprocessingDrawing" xmlns:wp="http://schemas.openxmlformats.org/drawingml/2006/wordprocessingDrawing" xmlns:w10="urn:schemas-microsoft-com:office:word" xmlns:w="http://schemas.openxmlformats.org/wordprocessingml/2006/main" xmlns:w14="http://schemas.microsoft.com/office/word/2010/wordml" xmlns:w15="http://schemas.microsoft.com/office/word/2012/wordml" xmlns:w16cex="http://schemas.microsoft.com/office/word/2018/wordml/cex" xmlns:w16cid="http://schemas.microsoft.com/office/word/2016/wordml/cid" xmlns:w16="http://schemas.microsoft.com/office/word/2018/wordml" xmlns:w16sdtdh="http://schemas.microsoft.com/office/word/2020/wordml/sdtdatahash" xmlns:w16se="http://schemas.microsoft.com/office/word/2015/wordml/symex" xmlns:wpg="http://schemas.microsoft.com/office/word/2010/wordprocessingGroup" xmlns:wpi="http://schemas.microsoft.com/office/word/2010/wordprocessingInk" xmlns:wne="http://schemas.microsoft.com/office/word/2006/wordml" xmlns:wps="http://schemas.microsoft.com/office/word/2010/wordprocessingShape" mc:Ignorable="w14 w15 w16se w16cid w16 w16cex w16sdtdh wp14">
   <w:body>
     <w:p>
       <w:pPr>
@@ -549,9 +549,11 @@
       <w:r>
         <w:t xml:space="preserve">TwinCAT project and HMI project are in archive file: </w:t>
       </w:r>
+      <w:proofErr w:type="spellStart"/>
       <w:r>
         <w:t>TcVis_ShapeColor_stream_Solution.tnzip</w:t>
       </w:r>
+      <w:proofErr w:type="spellEnd"/>
     </w:p>
     <w:p>
       <w:r>
@@ -765,7 +767,15 @@
               <w:jc w:val="center"/>
             </w:pPr>
             <w:r>
-              <w:t>&lt;VideoPath&gt;</w:t>
+              <w:t>&lt;</w:t>
+            </w:r>
+            <w:proofErr w:type="spellStart"/>
+            <w:r>
+              <w:t>VideoPath</w:t>
+            </w:r>
+            <w:proofErr w:type="spellEnd"/>
+            <w:r>
+              <w:t>&gt;</w:t>
             </w:r>
           </w:p>
         </w:tc>
@@ -792,7 +802,15 @@
               <w:jc w:val="center"/>
             </w:pPr>
             <w:r>
-              <w:t>&lt;ScopeImageExportPath&gt;</w:t>
+              <w:t>&lt;</w:t>
+            </w:r>
+            <w:proofErr w:type="spellStart"/>
+            <w:r>
+              <w:t>ScopeImageExportPath</w:t>
+            </w:r>
+            <w:proofErr w:type="spellEnd"/>
+            <w:r>
+              <w:t>&gt;</w:t>
             </w:r>
           </w:p>
         </w:tc>
@@ -846,694 +864,13 @@
       <w:bookmarkEnd w:id="3"/>
     </w:p>
     <w:p>
-      <w:pPr>
-        <w:pStyle w:val="Heading4"/>
-      </w:pPr>
       <w:r>
         <w:t>Virtual Directory</w:t>
       </w:r>
     </w:p>
     <w:p>
-      <w:pPr>
-        <w:ind w:firstLine="720"/>
-      </w:pPr>
-      <w:r>
-        <w:t>In order for the HMI server to load a video file, it needs to know where it should look. To give it a way to access the directory where the video files are stored, a virtual directory can be made in the TcHmiSrv setting of the project. This is located under the “Server” node of the solution explorer.</w:t>
-      </w:r>
-      <w:r>
-        <w:t xml:space="preserve"> </w:t>
-      </w:r>
-    </w:p>
-    <w:p>
-      <w:pPr>
-        <w:ind w:firstLine="720"/>
-      </w:pPr>
-      <w:r>
-        <w:t>First, these settings need to be made for the remote configuration</w:t>
-      </w:r>
-      <w:r>
-        <w:t>. From the dropdown labeled “Publish Configuration”, select remote (or if you have multiple configurations, which ever you plan to publish to the server). Then in the general tab, expand “Virtual directories” and click “Add Virtual directory.”</w:t>
-      </w:r>
-    </w:p>
-    <w:p>
-      <w:r>
-        <w:rPr>
-          <w:noProof/>
-        </w:rPr>
-        <w:lastRenderedPageBreak/>
-        <w:drawing>
-          <wp:inline distT="0" distB="0" distL="0" distR="0" wp14:anchorId="259B0B39" wp14:editId="72E89629">
-            <wp:extent cx="5943600" cy="3418205"/>
-            <wp:effectExtent l="0" t="0" r="0" b="0"/>
-            <wp:docPr id="3" name="Picture 3"/>
-            <wp:cNvGraphicFramePr>
-              <a:graphicFrameLocks xmlns:a="http://schemas.openxmlformats.org/drawingml/2006/main" noChangeAspect="1"/>
-            </wp:cNvGraphicFramePr>
-            <a:graphic xmlns:a="http://schemas.openxmlformats.org/drawingml/2006/main">
-              <a:graphicData uri="http://schemas.openxmlformats.org/drawingml/2006/picture">
-                <pic:pic xmlns:pic="http://schemas.openxmlformats.org/drawingml/2006/picture">
-                  <pic:nvPicPr>
-                    <pic:cNvPr id="1" name=""/>
-                    <pic:cNvPicPr/>
-                  </pic:nvPicPr>
-                  <pic:blipFill>
-                    <a:blip r:embed="rId12"/>
-                    <a:stretch>
-                      <a:fillRect/>
-                    </a:stretch>
-                  </pic:blipFill>
-                  <pic:spPr>
-                    <a:xfrm>
-                      <a:off x="0" y="0"/>
-                      <a:ext cx="5943600" cy="3418205"/>
-                    </a:xfrm>
-                    <a:prstGeom prst="rect">
-                      <a:avLst/>
-                    </a:prstGeom>
-                  </pic:spPr>
-                </pic:pic>
-              </a:graphicData>
-            </a:graphic>
-          </wp:inline>
-        </w:drawing>
-      </w:r>
-    </w:p>
-    <w:p>
-      <w:pPr>
-        <w:ind w:firstLine="720"/>
-      </w:pPr>
-      <w:r>
-        <w:t>In the new pop- Name the directory anything beginning with “/”(for this sample, it</w:t>
-      </w:r>
-      <w:r>
-        <w:t xml:space="preserve"> is named</w:t>
-      </w:r>
-      <w:r>
-        <w:t xml:space="preserve"> “/Videos”). And then enter the file path used for the virtual directory. This should be the same file p</w:t>
-      </w:r>
-      <w:r>
-        <w:t xml:space="preserve">ath used </w:t>
-      </w:r>
-      <w:r>
-        <w:t>in the PLC code.</w:t>
-      </w:r>
-    </w:p>
-    <w:p>
-      <w:r>
-        <w:rPr>
-          <w:noProof/>
-        </w:rPr>
-        <w:drawing>
-          <wp:inline distT="0" distB="0" distL="0" distR="0" wp14:anchorId="6D539F3B" wp14:editId="2039A1B0">
-            <wp:extent cx="5943600" cy="3469640"/>
-            <wp:effectExtent l="0" t="0" r="0" b="0"/>
-            <wp:docPr id="4" name="Picture 4"/>
-            <wp:cNvGraphicFramePr>
-              <a:graphicFrameLocks xmlns:a="http://schemas.openxmlformats.org/drawingml/2006/main" noChangeAspect="1"/>
-            </wp:cNvGraphicFramePr>
-            <a:graphic xmlns:a="http://schemas.openxmlformats.org/drawingml/2006/main">
-              <a:graphicData uri="http://schemas.openxmlformats.org/drawingml/2006/picture">
-                <pic:pic xmlns:pic="http://schemas.openxmlformats.org/drawingml/2006/picture">
-                  <pic:nvPicPr>
-                    <pic:cNvPr id="1" name=""/>
-                    <pic:cNvPicPr/>
-                  </pic:nvPicPr>
-                  <pic:blipFill>
-                    <a:blip r:embed="rId13"/>
-                    <a:stretch>
-                      <a:fillRect/>
-                    </a:stretch>
-                  </pic:blipFill>
-                  <pic:spPr>
-                    <a:xfrm>
-                      <a:off x="0" y="0"/>
-                      <a:ext cx="5943600" cy="3469640"/>
-                    </a:xfrm>
-                    <a:prstGeom prst="rect">
-                      <a:avLst/>
-                    </a:prstGeom>
-                  </pic:spPr>
-                </pic:pic>
-              </a:graphicData>
-            </a:graphic>
-          </wp:inline>
-        </w:drawing>
-      </w:r>
-    </w:p>
-    <w:p>
-      <w:pPr>
-        <w:ind w:firstLine="720"/>
-      </w:pPr>
-      <w:r>
-        <w:t xml:space="preserve">Once entered, click “Add” and then click “Accept.” With </w:t>
-      </w:r>
-      <w:r>
-        <w:t>that finished, the next time</w:t>
-      </w:r>
-      <w:r>
-        <w:t xml:space="preserve"> the HMI </w:t>
-      </w:r>
-      <w:r>
-        <w:t>is published</w:t>
-      </w:r>
-      <w:r>
-        <w:t xml:space="preserve">, the virtual directory will be </w:t>
-      </w:r>
-      <w:r>
-        <w:t>accessible</w:t>
-      </w:r>
-      <w:r>
-        <w:t>.</w:t>
-      </w:r>
-    </w:p>
-    <w:p>
-      <w:pPr>
-        <w:pStyle w:val="Heading4"/>
-      </w:pPr>
-      <w:r>
-        <w:lastRenderedPageBreak/>
-        <w:t>Contents</w:t>
-      </w:r>
-    </w:p>
-    <w:p>
-      <w:r>
-        <w:t>EventView</w:t>
-      </w:r>
-    </w:p>
-    <w:p>
-      <w:r>
-        <w:tab/>
-        <w:t>The EventView content contains an Event grid and 3 buttons. One for triggering a test event, one for clearing the active alarm, and one for playing the video of the selected event.</w:t>
-      </w:r>
-    </w:p>
-    <w:p>
-      <w:r>
-        <w:t>In order to play the video, the user simply clicks on the event they wish to view and then click the video playback button. If the video file exists, the content will be switched to the VideoPlayback content. There the video will be loaded</w:t>
-      </w:r>
-    </w:p>
-    <w:p>
-      <w:r>
-        <w:t>VideoPlayback</w:t>
-      </w:r>
-    </w:p>
-    <w:p>
-      <w:r>
-        <w:t>This content contains only the Video Player control for video playback. When adding the video player, it is important that the “SrcList” property be blank, or else the control</w:t>
-      </w:r>
-      <w:bookmarkStart w:id="4" w:name="_GoBack"/>
-      <w:bookmarkEnd w:id="4"/>
-      <w:r>
-        <w:t xml:space="preserve"> will throw an error when loaded.</w:t>
-      </w:r>
-    </w:p>
-    <w:p>
-      <w:pPr>
-        <w:pStyle w:val="Heading4"/>
-      </w:pPr>
       <w:r>
         <w:t>Functions</w:t>
-      </w:r>
-    </w:p>
-    <w:p>
-      <w:pPr>
-        <w:pStyle w:val="Heading5"/>
-      </w:pPr>
-      <w:r>
-        <w:t>OpenSelectedEventVideo</w:t>
-      </w:r>
-    </w:p>
-    <w:p>
-      <w:pPr>
-        <w:ind w:firstLine="720"/>
-      </w:pPr>
-      <w:r>
-        <w:t>To load the video file and play it, the HMI needs to perform a few steps first. When you select the desired event from the Event Grid, and press the Video Playback button, the HMI will start by grabbing the relevant data from the EventGrid.</w:t>
-      </w:r>
-      <w:r>
-        <w:t xml:space="preserve"> What it needs to find is the timestamp of when the event was received, which should be the same as the timestamp used in the PLC. </w:t>
-      </w:r>
-    </w:p>
-    <w:p>
-      <w:pPr>
-        <w:ind w:firstLine="720"/>
-      </w:pPr>
-      <w:r>
-        <w:t>The first section of this function gets the Event Grid and creates a variable for it in the function. Then, it gets the event currently selected by the user:</w:t>
-      </w:r>
-    </w:p>
-    <w:p>
-      <w:r>
-        <w:rPr>
-          <w:noProof/>
-        </w:rPr>
-        <w:drawing>
-          <wp:inline distT="0" distB="0" distL="0" distR="0" wp14:anchorId="2C45D765" wp14:editId="5552E1CA">
-            <wp:extent cx="5943600" cy="1461770"/>
-            <wp:effectExtent l="0" t="0" r="0" b="5080"/>
-            <wp:docPr id="5" name="Picture 5"/>
-            <wp:cNvGraphicFramePr>
-              <a:graphicFrameLocks xmlns:a="http://schemas.openxmlformats.org/drawingml/2006/main" noChangeAspect="1"/>
-            </wp:cNvGraphicFramePr>
-            <a:graphic xmlns:a="http://schemas.openxmlformats.org/drawingml/2006/main">
-              <a:graphicData uri="http://schemas.openxmlformats.org/drawingml/2006/picture">
-                <pic:pic xmlns:pic="http://schemas.openxmlformats.org/drawingml/2006/picture">
-                  <pic:nvPicPr>
-                    <pic:cNvPr id="1" name=""/>
-                    <pic:cNvPicPr/>
-                  </pic:nvPicPr>
-                  <pic:blipFill>
-                    <a:blip r:embed="rId14"/>
-                    <a:stretch>
-                      <a:fillRect/>
-                    </a:stretch>
-                  </pic:blipFill>
-                  <pic:spPr>
-                    <a:xfrm>
-                      <a:off x="0" y="0"/>
-                      <a:ext cx="5943600" cy="1461770"/>
-                    </a:xfrm>
-                    <a:prstGeom prst="rect">
-                      <a:avLst/>
-                    </a:prstGeom>
-                  </pic:spPr>
-                </pic:pic>
-              </a:graphicData>
-            </a:graphic>
-          </wp:inline>
-        </w:drawing>
-      </w:r>
-    </w:p>
-    <w:p>
-      <w:pPr>
-        <w:ind w:firstLine="720"/>
-      </w:pPr>
-      <w:r>
-        <w:t>Once it has the event and assigns its data to a variable, it begins creating the name of the video file using the “timeReceived” property of the variable. First, by turning each part of the time stamp into its own string, and then concatenating them into the file name. the function used for certain parts named “number2string” is used to be sure that single digit values have a “0” placed before them to match the format of the timestamp.</w:t>
-      </w:r>
-    </w:p>
-    <w:p>
-      <w:r>
-        <w:rPr>
-          <w:noProof/>
-        </w:rPr>
-        <w:drawing>
-          <wp:inline distT="0" distB="0" distL="0" distR="0" wp14:anchorId="01D5AE41" wp14:editId="27093A35">
-            <wp:extent cx="5943600" cy="1508760"/>
-            <wp:effectExtent l="0" t="0" r="0" b="0"/>
-            <wp:docPr id="6" name="Picture 6"/>
-            <wp:cNvGraphicFramePr>
-              <a:graphicFrameLocks xmlns:a="http://schemas.openxmlformats.org/drawingml/2006/main" noChangeAspect="1"/>
-            </wp:cNvGraphicFramePr>
-            <a:graphic xmlns:a="http://schemas.openxmlformats.org/drawingml/2006/main">
-              <a:graphicData uri="http://schemas.openxmlformats.org/drawingml/2006/picture">
-                <pic:pic xmlns:pic="http://schemas.openxmlformats.org/drawingml/2006/picture">
-                  <pic:nvPicPr>
-                    <pic:cNvPr id="1" name=""/>
-                    <pic:cNvPicPr/>
-                  </pic:nvPicPr>
-                  <pic:blipFill>
-                    <a:blip r:embed="rId15"/>
-                    <a:stretch>
-                      <a:fillRect/>
-                    </a:stretch>
-                  </pic:blipFill>
-                  <pic:spPr>
-                    <a:xfrm>
-                      <a:off x="0" y="0"/>
-                      <a:ext cx="5943600" cy="1508760"/>
-                    </a:xfrm>
-                    <a:prstGeom prst="rect">
-                      <a:avLst/>
-                    </a:prstGeom>
-                  </pic:spPr>
-                </pic:pic>
-              </a:graphicData>
-            </a:graphic>
-          </wp:inline>
-        </w:drawing>
-      </w:r>
-    </w:p>
-    <w:p>
-      <w:r>
-        <w:lastRenderedPageBreak/>
-        <w:tab/>
-      </w:r>
-      <w:r>
-        <w:t>The UTC timestamp is used, because the Event Logger uses the same for the time raised timestamp in the PLC, which is what is used to name the video file during its creation.</w:t>
-      </w:r>
-    </w:p>
-    <w:p>
-      <w:pPr>
-        <w:ind w:firstLine="720"/>
-      </w:pPr>
-      <w:r>
-        <w:t>Once the filename is created, the function calls the CheckforVideo function to make sure the file is in the virtual directory. If it is not found in the virtual directory, the function ends here.</w:t>
-      </w:r>
-      <w:r>
-        <w:t xml:space="preserve"> How this function is programmed is shown later.</w:t>
-      </w:r>
-    </w:p>
-    <w:p>
-      <w:r>
-        <w:rPr>
-          <w:noProof/>
-        </w:rPr>
-        <w:drawing>
-          <wp:inline distT="0" distB="0" distL="0" distR="0" wp14:anchorId="1C6ADCD1" wp14:editId="20E5B116">
-            <wp:extent cx="5943600" cy="784225"/>
-            <wp:effectExtent l="0" t="0" r="0" b="0"/>
-            <wp:docPr id="7" name="Picture 7"/>
-            <wp:cNvGraphicFramePr>
-              <a:graphicFrameLocks xmlns:a="http://schemas.openxmlformats.org/drawingml/2006/main" noChangeAspect="1"/>
-            </wp:cNvGraphicFramePr>
-            <a:graphic xmlns:a="http://schemas.openxmlformats.org/drawingml/2006/main">
-              <a:graphicData uri="http://schemas.openxmlformats.org/drawingml/2006/picture">
-                <pic:pic xmlns:pic="http://schemas.openxmlformats.org/drawingml/2006/picture">
-                  <pic:nvPicPr>
-                    <pic:cNvPr id="1" name=""/>
-                    <pic:cNvPicPr/>
-                  </pic:nvPicPr>
-                  <pic:blipFill>
-                    <a:blip r:embed="rId16"/>
-                    <a:stretch>
-                      <a:fillRect/>
-                    </a:stretch>
-                  </pic:blipFill>
-                  <pic:spPr>
-                    <a:xfrm>
-                      <a:off x="0" y="0"/>
-                      <a:ext cx="5943600" cy="784225"/>
-                    </a:xfrm>
-                    <a:prstGeom prst="rect">
-                      <a:avLst/>
-                    </a:prstGeom>
-                  </pic:spPr>
-                </pic:pic>
-              </a:graphicData>
-            </a:graphic>
-          </wp:inline>
-        </w:drawing>
-      </w:r>
-    </w:p>
-    <w:p>
-      <w:pPr>
-        <w:ind w:firstLine="720"/>
-      </w:pPr>
-      <w:r>
-        <w:t>If the video file is found, the function then switches the currently viewed content of the region to display the video player.</w:t>
-      </w:r>
-      <w:r>
-        <w:t xml:space="preserve"> The function is told to wait a certain number of milliseconds to ensure that the content is loaded, and the video player element is attached before getting the player and assigning it to a variable. Finally the function appends the virtual directory to the filename, and sets the video player’s source to said file path. The video immediately begins playing after.</w:t>
-      </w:r>
-    </w:p>
-    <w:p>
-      <w:r>
-        <w:rPr>
-          <w:noProof/>
-        </w:rPr>
-        <w:drawing>
-          <wp:inline distT="0" distB="0" distL="0" distR="0" wp14:anchorId="5EF61F48" wp14:editId="231AF190">
-            <wp:extent cx="5619048" cy="3009524"/>
-            <wp:effectExtent l="0" t="0" r="1270" b="635"/>
-            <wp:docPr id="8" name="Picture 8"/>
-            <wp:cNvGraphicFramePr>
-              <a:graphicFrameLocks xmlns:a="http://schemas.openxmlformats.org/drawingml/2006/main" noChangeAspect="1"/>
-            </wp:cNvGraphicFramePr>
-            <a:graphic xmlns:a="http://schemas.openxmlformats.org/drawingml/2006/main">
-              <a:graphicData uri="http://schemas.openxmlformats.org/drawingml/2006/picture">
-                <pic:pic xmlns:pic="http://schemas.openxmlformats.org/drawingml/2006/picture">
-                  <pic:nvPicPr>
-                    <pic:cNvPr id="1" name=""/>
-                    <pic:cNvPicPr/>
-                  </pic:nvPicPr>
-                  <pic:blipFill>
-                    <a:blip r:embed="rId17"/>
-                    <a:stretch>
-                      <a:fillRect/>
-                    </a:stretch>
-                  </pic:blipFill>
-                  <pic:spPr>
-                    <a:xfrm>
-                      <a:off x="0" y="0"/>
-                      <a:ext cx="5619048" cy="3009524"/>
-                    </a:xfrm>
-                    <a:prstGeom prst="rect">
-                      <a:avLst/>
-                    </a:prstGeom>
-                  </pic:spPr>
-                </pic:pic>
-              </a:graphicData>
-            </a:graphic>
-          </wp:inline>
-        </w:drawing>
-      </w:r>
-    </w:p>
-    <w:p>
-      <w:r>
-        <w:t>This is the sleep function created to force the function to wait a certain number of milliseconds.</w:t>
-      </w:r>
-    </w:p>
-    <w:p>
-      <w:r>
-        <w:rPr>
-          <w:noProof/>
-        </w:rPr>
-        <w:drawing>
-          <wp:inline distT="0" distB="0" distL="0" distR="0" wp14:anchorId="575C7CCF" wp14:editId="122CF7EE">
-            <wp:extent cx="4266667" cy="438095"/>
-            <wp:effectExtent l="0" t="0" r="635" b="635"/>
-            <wp:docPr id="13" name="Picture 13"/>
-            <wp:cNvGraphicFramePr>
-              <a:graphicFrameLocks xmlns:a="http://schemas.openxmlformats.org/drawingml/2006/main" noChangeAspect="1"/>
-            </wp:cNvGraphicFramePr>
-            <a:graphic xmlns:a="http://schemas.openxmlformats.org/drawingml/2006/main">
-              <a:graphicData uri="http://schemas.openxmlformats.org/drawingml/2006/picture">
-                <pic:pic xmlns:pic="http://schemas.openxmlformats.org/drawingml/2006/picture">
-                  <pic:nvPicPr>
-                    <pic:cNvPr id="1" name=""/>
-                    <pic:cNvPicPr/>
-                  </pic:nvPicPr>
-                  <pic:blipFill>
-                    <a:blip r:embed="rId18"/>
-                    <a:stretch>
-                      <a:fillRect/>
-                    </a:stretch>
-                  </pic:blipFill>
-                  <pic:spPr>
-                    <a:xfrm>
-                      <a:off x="0" y="0"/>
-                      <a:ext cx="4266667" cy="438095"/>
-                    </a:xfrm>
-                    <a:prstGeom prst="rect">
-                      <a:avLst/>
-                    </a:prstGeom>
-                  </pic:spPr>
-                </pic:pic>
-              </a:graphicData>
-            </a:graphic>
-          </wp:inline>
-        </w:drawing>
-      </w:r>
-    </w:p>
-    <w:p>
-      <w:r>
-        <w:t>Here is the simple function for making sure the timestamp portion fits the format of the video file.</w:t>
-      </w:r>
-    </w:p>
-    <w:p>
-      <w:r>
-        <w:rPr>
-          <w:noProof/>
-        </w:rPr>
-        <w:lastRenderedPageBreak/>
-        <w:drawing>
-          <wp:inline distT="0" distB="0" distL="0" distR="0" wp14:anchorId="6A802C35" wp14:editId="568220C8">
-            <wp:extent cx="5943600" cy="955675"/>
-            <wp:effectExtent l="0" t="0" r="0" b="0"/>
-            <wp:docPr id="10" name="Picture 10"/>
-            <wp:cNvGraphicFramePr>
-              <a:graphicFrameLocks xmlns:a="http://schemas.openxmlformats.org/drawingml/2006/main" noChangeAspect="1"/>
-            </wp:cNvGraphicFramePr>
-            <a:graphic xmlns:a="http://schemas.openxmlformats.org/drawingml/2006/main">
-              <a:graphicData uri="http://schemas.openxmlformats.org/drawingml/2006/picture">
-                <pic:pic xmlns:pic="http://schemas.openxmlformats.org/drawingml/2006/picture">
-                  <pic:nvPicPr>
-                    <pic:cNvPr id="1" name=""/>
-                    <pic:cNvPicPr/>
-                  </pic:nvPicPr>
-                  <pic:blipFill>
-                    <a:blip r:embed="rId19"/>
-                    <a:stretch>
-                      <a:fillRect/>
-                    </a:stretch>
-                  </pic:blipFill>
-                  <pic:spPr>
-                    <a:xfrm>
-                      <a:off x="0" y="0"/>
-                      <a:ext cx="5943600" cy="955675"/>
-                    </a:xfrm>
-                    <a:prstGeom prst="rect">
-                      <a:avLst/>
-                    </a:prstGeom>
-                  </pic:spPr>
-                </pic:pic>
-              </a:graphicData>
-            </a:graphic>
-          </wp:inline>
-        </w:drawing>
-      </w:r>
-    </w:p>
-    <w:p>
-      <w:pPr>
-        <w:pStyle w:val="Heading5"/>
-      </w:pPr>
-      <w:r>
-        <w:t>CheckForVideo</w:t>
-      </w:r>
-    </w:p>
-    <w:p>
-      <w:pPr>
-        <w:ind w:firstLine="720"/>
-      </w:pPr>
-      <w:r>
-        <w:t xml:space="preserve">This function is used to </w:t>
-      </w:r>
-      <w:r>
-        <w:t>check if a specific file exists within the virtual directory you created previously. It accepts a file name as a string, and then calls a server function to get a list of files, and checks if the filename is a part of that list by key.</w:t>
-      </w:r>
-    </w:p>
-    <w:p>
-      <w:r>
-        <w:tab/>
-        <w:t xml:space="preserve">To begin, the function creates a Promise so the function will not end before its task is complete. Within the Promise, the function “TcHmi.Server.writeSymbol” is called. The symbol being written to is “ListFiles”, which is a function in the server that lists the contents of the folder path written to it. In this case, the folder is the virtual directory created previously (“/Videos” in this sample). When ListFiles is complete, the contents will be returned through a callback. The </w:t>
-      </w:r>
-      <w:r>
-        <w:t>Promise</w:t>
-      </w:r>
-      <w:r>
-        <w:t xml:space="preserve"> checks the data returned in the “data.results[]” object to see if there is a value with a key matching the file name it was passed. If it was found the Pormise resolves as true, if it is not found, it resolves as false. </w:t>
-      </w:r>
-    </w:p>
-    <w:p>
-      <w:r>
-        <w:rPr>
-          <w:noProof/>
-        </w:rPr>
-        <w:drawing>
-          <wp:inline distT="0" distB="0" distL="0" distR="0" wp14:anchorId="0F3CAF23" wp14:editId="404EFBE9">
-            <wp:extent cx="5936615" cy="3964940"/>
-            <wp:effectExtent l="0" t="0" r="6985" b="0"/>
-            <wp:docPr id="11" name="Picture 11" descr="C:\Users\NathanM\AppData\Local\Temp\\SnagitTemp\Snag_46efd9.png"/>
-            <wp:cNvGraphicFramePr>
-              <a:graphicFrameLocks xmlns:a="http://schemas.openxmlformats.org/drawingml/2006/main" noChangeAspect="1"/>
-            </wp:cNvGraphicFramePr>
-            <a:graphic xmlns:a="http://schemas.openxmlformats.org/drawingml/2006/main">
-              <a:graphicData uri="http://schemas.openxmlformats.org/drawingml/2006/picture">
-                <pic:pic xmlns:pic="http://schemas.openxmlformats.org/drawingml/2006/picture">
-                  <pic:nvPicPr>
-                    <pic:cNvPr id="0" name="Picture 1" descr="C:\Users\NathanM\AppData\Local\Temp\\SnagitTemp\Snag_46efd9.png"/>
-                    <pic:cNvPicPr>
-                      <a:picLocks noChangeAspect="1" noChangeArrowheads="1"/>
-                    </pic:cNvPicPr>
-                  </pic:nvPicPr>
-                  <pic:blipFill>
-                    <a:blip r:embed="rId20">
-                      <a:extLst>
-                        <a:ext uri="{28A0092B-C50C-407E-A947-70E740481C1C}">
-                          <a14:useLocalDpi xmlns:a14="http://schemas.microsoft.com/office/drawing/2010/main" val="0"/>
-                        </a:ext>
-                      </a:extLst>
-                    </a:blip>
-                    <a:srcRect/>
-                    <a:stretch>
-                      <a:fillRect/>
-                    </a:stretch>
-                  </pic:blipFill>
-                  <pic:spPr bwMode="auto">
-                    <a:xfrm>
-                      <a:off x="0" y="0"/>
-                      <a:ext cx="5936615" cy="3964940"/>
-                    </a:xfrm>
-                    <a:prstGeom prst="rect">
-                      <a:avLst/>
-                    </a:prstGeom>
-                    <a:noFill/>
-                    <a:ln>
-                      <a:noFill/>
-                    </a:ln>
-                  </pic:spPr>
-                </pic:pic>
-              </a:graphicData>
-            </a:graphic>
-          </wp:inline>
-        </w:drawing>
-      </w:r>
-    </w:p>
-    <w:p>
-      <w:r>
-        <w:t xml:space="preserve">With the promise declared, it is then called, and the resolved value is passed to a Boolean </w:t>
-      </w:r>
-      <w:r>
-        <w:t xml:space="preserve">variable in the CheckforVideo function </w:t>
-      </w:r>
-      <w:r>
-        <w:t>which is returned to the function’s caller.</w:t>
-      </w:r>
-    </w:p>
-    <w:p>
-      <w:r>
-        <w:rPr>
-          <w:noProof/>
-        </w:rPr>
-        <w:lastRenderedPageBreak/>
-        <w:drawing>
-          <wp:inline distT="0" distB="0" distL="0" distR="0" wp14:anchorId="27E3B879" wp14:editId="6628C1F6">
-            <wp:extent cx="5161905" cy="1219048"/>
-            <wp:effectExtent l="0" t="0" r="1270" b="635"/>
-            <wp:docPr id="12" name="Picture 12"/>
-            <wp:cNvGraphicFramePr>
-              <a:graphicFrameLocks xmlns:a="http://schemas.openxmlformats.org/drawingml/2006/main" noChangeAspect="1"/>
-            </wp:cNvGraphicFramePr>
-            <a:graphic xmlns:a="http://schemas.openxmlformats.org/drawingml/2006/main">
-              <a:graphicData uri="http://schemas.openxmlformats.org/drawingml/2006/picture">
-                <pic:pic xmlns:pic="http://schemas.openxmlformats.org/drawingml/2006/picture">
-                  <pic:nvPicPr>
-                    <pic:cNvPr id="1" name=""/>
-                    <pic:cNvPicPr/>
-                  </pic:nvPicPr>
-                  <pic:blipFill>
-                    <a:blip r:embed="rId21"/>
-                    <a:stretch>
-                      <a:fillRect/>
-                    </a:stretch>
-                  </pic:blipFill>
-                  <pic:spPr>
-                    <a:xfrm>
-                      <a:off x="0" y="0"/>
-                      <a:ext cx="5161905" cy="1219048"/>
-                    </a:xfrm>
-                    <a:prstGeom prst="rect">
-                      <a:avLst/>
-                    </a:prstGeom>
-                  </pic:spPr>
-                </pic:pic>
-              </a:graphicData>
-            </a:graphic>
-          </wp:inline>
-        </w:drawing>
-      </w:r>
-    </w:p>
-    <w:p>
-      <w:pPr>
-        <w:pStyle w:val="Heading3"/>
-      </w:pPr>
-      <w:bookmarkStart w:id="5" w:name="_Toc94192273"/>
-      <w:r>
-        <w:t>PLC Setup</w:t>
-      </w:r>
-      <w:bookmarkEnd w:id="5"/>
-      <w:r>
-        <w:t xml:space="preserve"> </w:t>
       </w:r>
     </w:p>
     <w:p/>
@@ -1541,11 +878,25 @@
       <w:pPr>
         <w:pStyle w:val="Heading3"/>
       </w:pPr>
-      <w:bookmarkStart w:id="6" w:name="_Toc94192274"/>
+      <w:bookmarkStart w:id="4" w:name="_Toc94192273"/>
+      <w:r>
+        <w:t>PLC Setup</w:t>
+      </w:r>
+      <w:bookmarkEnd w:id="4"/>
+      <w:r>
+        <w:t xml:space="preserve"> </w:t>
+      </w:r>
+    </w:p>
+    <w:p/>
+    <w:p>
+      <w:pPr>
+        <w:pStyle w:val="Heading3"/>
+      </w:pPr>
+      <w:bookmarkStart w:id="5" w:name="_Toc94192274"/>
       <w:r>
         <w:t>Scope Setup</w:t>
       </w:r>
-      <w:bookmarkEnd w:id="6"/>
+      <w:bookmarkEnd w:id="5"/>
     </w:p>
     <w:sectPr>
       <w:pgSz w:w="12240" w:h="15840"/>
@@ -1558,7 +909,7 @@
 </file>
 
 <file path=word/numbering.xml><?xml version="1.0" encoding="utf-8"?>
-<w:numbering xmlns:wpc="http://schemas.microsoft.com/office/word/2010/wordprocessingCanvas" xmlns:cx="http://schemas.microsoft.com/office/drawing/2014/chartex" xmlns:cx1="http://schemas.microsoft.com/office/drawing/2015/9/8/chartex" xmlns:mc="http://schemas.openxmlformats.org/markup-compatibility/2006" xmlns:o="urn:schemas-microsoft-com:office:office" xmlns:r="http://schemas.openxmlformats.org/officeDocument/2006/relationships" xmlns:m="http://schemas.openxmlformats.org/officeDocument/2006/math" xmlns:v="urn:schemas-microsoft-com:vml" xmlns:wp14="http://schemas.microsoft.com/office/word/2010/wordprocessingDrawing" xmlns:wp="http://schemas.openxmlformats.org/drawingml/2006/wordprocessingDrawing" xmlns:w10="urn:schemas-microsoft-com:office:word" xmlns:w="http://schemas.openxmlformats.org/wordprocessingml/2006/main" xmlns:w14="http://schemas.microsoft.com/office/word/2010/wordml" xmlns:w15="http://schemas.microsoft.com/office/word/2012/wordml" xmlns:w16se="http://schemas.microsoft.com/office/word/2015/wordml/symex" xmlns:wpg="http://schemas.microsoft.com/office/word/2010/wordprocessingGroup" xmlns:wpi="http://schemas.microsoft.com/office/word/2010/wordprocessingInk" xmlns:wne="http://schemas.microsoft.com/office/word/2006/wordml" xmlns:wps="http://schemas.microsoft.com/office/word/2010/wordprocessingShape" mc:Ignorable="w14 w15 w16se wp14">
+<w:numbering xmlns:wpc="http://schemas.microsoft.com/office/word/2010/wordprocessingCanvas" xmlns:cx="http://schemas.microsoft.com/office/drawing/2014/chartex" xmlns:cx1="http://schemas.microsoft.com/office/drawing/2015/9/8/chartex" xmlns:cx2="http://schemas.microsoft.com/office/drawing/2015/10/21/chartex" xmlns:cx3="http://schemas.microsoft.com/office/drawing/2016/5/9/chartex" xmlns:cx4="http://schemas.microsoft.com/office/drawing/2016/5/10/chartex" xmlns:cx5="http://schemas.microsoft.com/office/drawing/2016/5/11/chartex" xmlns:cx6="http://schemas.microsoft.com/office/drawing/2016/5/12/chartex" xmlns:cx7="http://schemas.microsoft.com/office/drawing/2016/5/13/chartex" xmlns:cx8="http://schemas.microsoft.com/office/drawing/2016/5/14/chartex" xmlns:mc="http://schemas.openxmlformats.org/markup-compatibility/2006" xmlns:aink="http://schemas.microsoft.com/office/drawing/2016/ink" xmlns:am3d="http://schemas.microsoft.com/office/drawing/2017/model3d" xmlns:o="urn:schemas-microsoft-com:office:office" xmlns:r="http://schemas.openxmlformats.org/officeDocument/2006/relationships" xmlns:m="http://schemas.openxmlformats.org/officeDocument/2006/math" xmlns:v="urn:schemas-microsoft-com:vml" xmlns:wp14="http://schemas.microsoft.com/office/word/2010/wordprocessingDrawing" xmlns:wp="http://schemas.openxmlformats.org/drawingml/2006/wordprocessingDrawing" xmlns:w10="urn:schemas-microsoft-com:office:word" xmlns:w="http://schemas.openxmlformats.org/wordprocessingml/2006/main" xmlns:w14="http://schemas.microsoft.com/office/word/2010/wordml" xmlns:w15="http://schemas.microsoft.com/office/word/2012/wordml" xmlns:w16cex="http://schemas.microsoft.com/office/word/2018/wordml/cex" xmlns:w16cid="http://schemas.microsoft.com/office/word/2016/wordml/cid" xmlns:w16="http://schemas.microsoft.com/office/word/2018/wordml" xmlns:w16sdtdh="http://schemas.microsoft.com/office/word/2020/wordml/sdtdatahash" xmlns:w16se="http://schemas.microsoft.com/office/word/2015/wordml/symex" xmlns:wpg="http://schemas.microsoft.com/office/word/2010/wordprocessingGroup" xmlns:wpi="http://schemas.microsoft.com/office/word/2010/wordprocessingInk" xmlns:wne="http://schemas.microsoft.com/office/word/2006/wordml" xmlns:wps="http://schemas.microsoft.com/office/word/2010/wordprocessingShape" mc:Ignorable="w14 w15 w16se w16cid w16 w16cex w16sdtdh wp14">
   <w:abstractNum w:abstractNumId="0" w15:restartNumberingAfterBreak="0">
     <w:nsid w:val="18360117"/>
     <w:multiLevelType w:val="hybridMultilevel"/>
@@ -1839,7 +1190,7 @@
 </file>
 
 <file path=word/styles.xml><?xml version="1.0" encoding="utf-8"?>
-<w:styles xmlns:mc="http://schemas.openxmlformats.org/markup-compatibility/2006" xmlns:r="http://schemas.openxmlformats.org/officeDocument/2006/relationships" xmlns:w="http://schemas.openxmlformats.org/wordprocessingml/2006/main" xmlns:w14="http://schemas.microsoft.com/office/word/2010/wordml" xmlns:w15="http://schemas.microsoft.com/office/word/2012/wordml" xmlns:w16se="http://schemas.microsoft.com/office/word/2015/wordml/symex" mc:Ignorable="w14 w15 w16se">
+<w:styles xmlns:mc="http://schemas.openxmlformats.org/markup-compatibility/2006" xmlns:r="http://schemas.openxmlformats.org/officeDocument/2006/relationships" xmlns:w="http://schemas.openxmlformats.org/wordprocessingml/2006/main" xmlns:w14="http://schemas.microsoft.com/office/word/2010/wordml" xmlns:w15="http://schemas.microsoft.com/office/word/2012/wordml" xmlns:w16cex="http://schemas.microsoft.com/office/word/2018/wordml/cex" xmlns:w16cid="http://schemas.microsoft.com/office/word/2016/wordml/cid" xmlns:w16="http://schemas.microsoft.com/office/word/2018/wordml" xmlns:w16sdtdh="http://schemas.microsoft.com/office/word/2020/wordml/sdtdatahash" xmlns:w16se="http://schemas.microsoft.com/office/word/2015/wordml/symex" mc:Ignorable="w14 w15 w16se w16cid w16 w16cex w16sdtdh">
   <w:docDefaults>
     <w:rPrDefault>
       <w:rPr>
@@ -1855,7 +1206,7 @@
       </w:pPr>
     </w:pPrDefault>
   </w:docDefaults>
-  <w:latentStyles w:defLockedState="0" w:defUIPriority="99" w:defSemiHidden="0" w:defUnhideWhenUsed="0" w:defQFormat="0" w:count="371">
+  <w:latentStyles w:defLockedState="0" w:defUIPriority="99" w:defSemiHidden="0" w:defUnhideWhenUsed="0" w:defQFormat="0" w:count="376">
     <w:lsdException w:name="Normal" w:uiPriority="0" w:qFormat="1"/>
     <w:lsdException w:name="heading 1" w:uiPriority="9" w:qFormat="1"/>
     <w:lsdException w:name="heading 2" w:semiHidden="1" w:uiPriority="9" w:unhideWhenUsed="1" w:qFormat="1"/>
@@ -2227,6 +1578,11 @@
     <w:lsdException w:name="List Table 5 Dark Accent 6" w:uiPriority="50"/>
     <w:lsdException w:name="List Table 6 Colorful Accent 6" w:uiPriority="51"/>
     <w:lsdException w:name="List Table 7 Colorful Accent 6" w:uiPriority="52"/>
+    <w:lsdException w:name="Mention" w:semiHidden="1" w:unhideWhenUsed="1"/>
+    <w:lsdException w:name="Smart Hyperlink" w:semiHidden="1" w:unhideWhenUsed="1"/>
+    <w:lsdException w:name="Hashtag" w:semiHidden="1" w:unhideWhenUsed="1"/>
+    <w:lsdException w:name="Unresolved Mention" w:semiHidden="1" w:unhideWhenUsed="1"/>
+    <w:lsdException w:name="Smart Link" w:semiHidden="1" w:unhideWhenUsed="1"/>
   </w:latentStyles>
   <w:style w:type="paragraph" w:default="1" w:styleId="Normal">
     <w:name w:val="Normal"/>
@@ -2295,48 +1651,6 @@
       <w:color w:val="1F4D78" w:themeColor="accent1" w:themeShade="7F"/>
       <w:sz w:val="24"/>
       <w:szCs w:val="24"/>
-    </w:rPr>
-  </w:style>
-  <w:style w:type="paragraph" w:styleId="Heading4">
-    <w:name w:val="heading 4"/>
-    <w:basedOn w:val="Normal"/>
-    <w:next w:val="Normal"/>
-    <w:link w:val="Heading4Char"/>
-    <w:uiPriority w:val="9"/>
-    <w:unhideWhenUsed/>
-    <w:qFormat/>
-    <w:rsid w:val="0042723D"/>
-    <w:pPr>
-      <w:keepNext/>
-      <w:keepLines/>
-      <w:spacing w:before="40" w:after="0"/>
-      <w:outlineLvl w:val="3"/>
-    </w:pPr>
-    <w:rPr>
-      <w:rFonts w:asciiTheme="majorHAnsi" w:eastAsiaTheme="majorEastAsia" w:hAnsiTheme="majorHAnsi" w:cstheme="majorBidi"/>
-      <w:i/>
-      <w:iCs/>
-      <w:color w:val="2E74B5" w:themeColor="accent1" w:themeShade="BF"/>
-    </w:rPr>
-  </w:style>
-  <w:style w:type="paragraph" w:styleId="Heading5">
-    <w:name w:val="heading 5"/>
-    <w:basedOn w:val="Normal"/>
-    <w:next w:val="Normal"/>
-    <w:link w:val="Heading5Char"/>
-    <w:uiPriority w:val="9"/>
-    <w:unhideWhenUsed/>
-    <w:qFormat/>
-    <w:rsid w:val="00CA2E7B"/>
-    <w:pPr>
-      <w:keepNext/>
-      <w:keepLines/>
-      <w:spacing w:before="40" w:after="0"/>
-      <w:outlineLvl w:val="4"/>
-    </w:pPr>
-    <w:rPr>
-      <w:rFonts w:asciiTheme="majorHAnsi" w:eastAsiaTheme="majorEastAsia" w:hAnsiTheme="majorHAnsi" w:cstheme="majorBidi"/>
-      <w:color w:val="2E74B5" w:themeColor="accent1" w:themeShade="BF"/>
     </w:rPr>
   </w:style>
   <w:style w:type="character" w:default="1" w:styleId="DefaultParagraphFont">
@@ -2483,30 +1797,6 @@
       <w:spacing w:after="100"/>
       <w:ind w:left="440"/>
     </w:pPr>
-  </w:style>
-  <w:style w:type="character" w:customStyle="1" w:styleId="Heading4Char">
-    <w:name w:val="Heading 4 Char"/>
-    <w:basedOn w:val="DefaultParagraphFont"/>
-    <w:link w:val="Heading4"/>
-    <w:uiPriority w:val="9"/>
-    <w:rsid w:val="0042723D"/>
-    <w:rPr>
-      <w:rFonts w:asciiTheme="majorHAnsi" w:eastAsiaTheme="majorEastAsia" w:hAnsiTheme="majorHAnsi" w:cstheme="majorBidi"/>
-      <w:i/>
-      <w:iCs/>
-      <w:color w:val="2E74B5" w:themeColor="accent1" w:themeShade="BF"/>
-    </w:rPr>
-  </w:style>
-  <w:style w:type="character" w:customStyle="1" w:styleId="Heading5Char">
-    <w:name w:val="Heading 5 Char"/>
-    <w:basedOn w:val="DefaultParagraphFont"/>
-    <w:link w:val="Heading5"/>
-    <w:uiPriority w:val="9"/>
-    <w:rsid w:val="00CA2E7B"/>
-    <w:rPr>
-      <w:rFonts w:asciiTheme="majorHAnsi" w:eastAsiaTheme="majorEastAsia" w:hAnsiTheme="majorHAnsi" w:cstheme="majorBidi"/>
-      <w:color w:val="2E74B5" w:themeColor="accent1" w:themeShade="BF"/>
-    </w:rPr>
   </w:style>
 </w:styles>
 </file>
@@ -2779,6 +2069,10 @@
 </file>
 
 <file path=customXml/item2.xml><?xml version="1.0" encoding="utf-8"?>
+<b:Sources xmlns:b="http://schemas.openxmlformats.org/officeDocument/2006/bibliography" xmlns="http://schemas.openxmlformats.org/officeDocument/2006/bibliography" SelectedStyle="\APASixthEditionOfficeOnline.xsl" StyleName="APA" Version="6"/>
+</file>
+
+<file path=customXml/item3.xml><?xml version="1.0" encoding="utf-8"?>
 <?mso-contentType ?>
 <FormTemplates xmlns="http://schemas.microsoft.com/sharepoint/v3/contenttype/forms">
   <Display>DocumentLibraryForm</Display>
@@ -2787,7 +2081,7 @@
 </FormTemplates>
 </file>
 
-<file path=customXml/item3.xml><?xml version="1.0" encoding="utf-8"?>
+<file path=customXml/item4.xml><?xml version="1.0" encoding="utf-8"?>
 <ct:contentTypeSchema xmlns:ct="http://schemas.microsoft.com/office/2006/metadata/contentType" xmlns:ma="http://schemas.microsoft.com/office/2006/metadata/properties/metaAttributes" ct:_="" ma:_="" ma:contentTypeName="Document" ma:contentTypeID="0x010100EE6E5C1C5B7B974290FEB10D1DCD8D31" ma:contentTypeVersion="12" ma:contentTypeDescription="Create a new document." ma:contentTypeScope="" ma:versionID="78699b2bd89bf2845925dba2fad9cd5f">
   <xsd:schema xmlns:xsd="http://www.w3.org/2001/XMLSchema" xmlns:xs="http://www.w3.org/2001/XMLSchema" xmlns:p="http://schemas.microsoft.com/office/2006/metadata/properties" xmlns:ns2="c69c2809-a790-48a5-85c4-6c52d07a2bbc" xmlns:ns3="302a1acb-8782-4a7a-ac83-47184c60ed90" targetNamespace="http://schemas.microsoft.com/office/2006/metadata/properties" ma:root="true" ma:fieldsID="7016652cebf24c8fab966be4d9fc64bd" ns2:_="" ns3:_="">
     <xsd:import namespace="c69c2809-a790-48a5-85c4-6c52d07a2bbc"/>
@@ -3004,10 +2298,6 @@
 </ct:contentTypeSchema>
 </file>
 
-<file path=customXml/item4.xml><?xml version="1.0" encoding="utf-8"?>
-<b:Sources xmlns:b="http://schemas.openxmlformats.org/officeDocument/2006/bibliography" xmlns="http://schemas.openxmlformats.org/officeDocument/2006/bibliography" SelectedStyle="\APASixthEditionOfficeOnline.xsl" StyleName="APA" Version="6"/>
-</file>
-
 <file path=customXml/itemProps1.xml><?xml version="1.0" encoding="utf-8"?>
 <ds:datastoreItem xmlns:ds="http://schemas.openxmlformats.org/officeDocument/2006/customXml" ds:itemID="{1BC7191A-1CC0-4233-8666-F5564399F7F1}">
   <ds:schemaRefs>
@@ -3018,6 +2308,14 @@
 </file>
 
 <file path=customXml/itemProps2.xml><?xml version="1.0" encoding="utf-8"?>
+<ds:datastoreItem xmlns:ds="http://schemas.openxmlformats.org/officeDocument/2006/customXml" ds:itemID="{DEAA1C43-CD60-487F-ACAF-54F186CB0593}">
+  <ds:schemaRefs>
+    <ds:schemaRef ds:uri="http://schemas.openxmlformats.org/officeDocument/2006/bibliography"/>
+  </ds:schemaRefs>
+</ds:datastoreItem>
+</file>
+
+<file path=customXml/itemProps3.xml><?xml version="1.0" encoding="utf-8"?>
 <ds:datastoreItem xmlns:ds="http://schemas.openxmlformats.org/officeDocument/2006/customXml" ds:itemID="{6D958086-F2B3-47C3-8FF6-E5FE965A77C1}">
   <ds:schemaRefs>
     <ds:schemaRef ds:uri="http://schemas.microsoft.com/sharepoint/v3/contenttype/forms"/>
@@ -3025,7 +2323,7 @@
 </ds:datastoreItem>
 </file>
 
-<file path=customXml/itemProps3.xml><?xml version="1.0" encoding="utf-8"?>
+<file path=customXml/itemProps4.xml><?xml version="1.0" encoding="utf-8"?>
 <ds:datastoreItem xmlns:ds="http://schemas.openxmlformats.org/officeDocument/2006/customXml" ds:itemID="{C7A87FEE-1A31-4CC1-9604-C506A491127C}">
   <ds:schemaRefs>
     <ds:schemaRef ds:uri="http://schemas.microsoft.com/office/2006/metadata/contentType"/>
@@ -3042,12 +2340,4 @@
     <ds:schemaRef ds:uri="http://schemas.microsoft.com/internal/obd"/>
   </ds:schemaRefs>
 </ds:datastoreItem>
-</file>
-
-<file path=customXml/itemProps4.xml><?xml version="1.0" encoding="utf-8"?>
-<ds:datastoreItem xmlns:ds="http://schemas.openxmlformats.org/officeDocument/2006/customXml" ds:itemID="{E5278275-8A00-4F6E-B3EF-78780E0703D4}">
-  <ds:schemaRefs>
-    <ds:schemaRef ds:uri="http://schemas.openxmlformats.org/officeDocument/2006/bibliography"/>
-  </ds:schemaRefs>
-</ds:datastoreItem>
 </file>
</xml_diff>

<commit_message>
Fixed issue with Video Playback. THe process has been ran from cllicking the trigger event button to clicking on the video Playback button.
</commit_message>
<xml_diff>
--- a/VideoPlaybackSupportFiles/README - Project Setup Notes.docx
+++ b/VideoPlaybackSupportFiles/README - Project Setup Notes.docx
@@ -1,6 +1,6 @@
 
 <file path=word/document.xml><?xml version="1.0" encoding="utf-8"?>
-<w:document xmlns:wpc="http://schemas.microsoft.com/office/word/2010/wordprocessingCanvas" xmlns:cx="http://schemas.microsoft.com/office/drawing/2014/chartex" xmlns:cx1="http://schemas.microsoft.com/office/drawing/2015/9/8/chartex" xmlns:cx2="http://schemas.microsoft.com/office/drawing/2015/10/21/chartex" xmlns:cx3="http://schemas.microsoft.com/office/drawing/2016/5/9/chartex" xmlns:cx4="http://schemas.microsoft.com/office/drawing/2016/5/10/chartex" xmlns:cx5="http://schemas.microsoft.com/office/drawing/2016/5/11/chartex" xmlns:cx6="http://schemas.microsoft.com/office/drawing/2016/5/12/chartex" xmlns:cx7="http://schemas.microsoft.com/office/drawing/2016/5/13/chartex" xmlns:cx8="http://schemas.microsoft.com/office/drawing/2016/5/14/chartex" xmlns:mc="http://schemas.openxmlformats.org/markup-compatibility/2006" xmlns:aink="http://schemas.microsoft.com/office/drawing/2016/ink" xmlns:am3d="http://schemas.microsoft.com/office/drawing/2017/model3d" xmlns:o="urn:schemas-microsoft-com:office:office" xmlns:r="http://schemas.openxmlformats.org/officeDocument/2006/relationships" xmlns:m="http://schemas.openxmlformats.org/officeDocument/2006/math" xmlns:v="urn:schemas-microsoft-com:vml" xmlns:wp14="http://schemas.microsoft.com/office/word/2010/wordprocessingDrawing" xmlns:wp="http://schemas.openxmlformats.org/drawingml/2006/wordprocessingDrawing" xmlns:w10="urn:schemas-microsoft-com:office:word" xmlns:w="http://schemas.openxmlformats.org/wordprocessingml/2006/main" xmlns:w14="http://schemas.microsoft.com/office/word/2010/wordml" xmlns:w15="http://schemas.microsoft.com/office/word/2012/wordml" xmlns:w16cex="http://schemas.microsoft.com/office/word/2018/wordml/cex" xmlns:w16cid="http://schemas.microsoft.com/office/word/2016/wordml/cid" xmlns:w16="http://schemas.microsoft.com/office/word/2018/wordml" xmlns:w16sdtdh="http://schemas.microsoft.com/office/word/2020/wordml/sdtdatahash" xmlns:w16se="http://schemas.microsoft.com/office/word/2015/wordml/symex" xmlns:wpg="http://schemas.microsoft.com/office/word/2010/wordprocessingGroup" xmlns:wpi="http://schemas.microsoft.com/office/word/2010/wordprocessingInk" xmlns:wne="http://schemas.microsoft.com/office/word/2006/wordml" xmlns:wps="http://schemas.microsoft.com/office/word/2010/wordprocessingShape" mc:Ignorable="w14 w15 w16se w16cid w16 w16cex w16sdtdh wp14">
+<w:document xmlns:wpc="http://schemas.microsoft.com/office/word/2010/wordprocessingCanvas" xmlns:cx="http://schemas.microsoft.com/office/drawing/2014/chartex" xmlns:cx1="http://schemas.microsoft.com/office/drawing/2015/9/8/chartex" xmlns:mc="http://schemas.openxmlformats.org/markup-compatibility/2006" xmlns:o="urn:schemas-microsoft-com:office:office" xmlns:r="http://schemas.openxmlformats.org/officeDocument/2006/relationships" xmlns:m="http://schemas.openxmlformats.org/officeDocument/2006/math" xmlns:v="urn:schemas-microsoft-com:vml" xmlns:wp14="http://schemas.microsoft.com/office/word/2010/wordprocessingDrawing" xmlns:wp="http://schemas.openxmlformats.org/drawingml/2006/wordprocessingDrawing" xmlns:w10="urn:schemas-microsoft-com:office:word" xmlns:w="http://schemas.openxmlformats.org/wordprocessingml/2006/main" xmlns:w14="http://schemas.microsoft.com/office/word/2010/wordml" xmlns:w15="http://schemas.microsoft.com/office/word/2012/wordml" xmlns:w16se="http://schemas.microsoft.com/office/word/2015/wordml/symex" xmlns:wpg="http://schemas.microsoft.com/office/word/2010/wordprocessingGroup" xmlns:wpi="http://schemas.microsoft.com/office/word/2010/wordprocessingInk" xmlns:wne="http://schemas.microsoft.com/office/word/2006/wordml" xmlns:wps="http://schemas.microsoft.com/office/word/2010/wordprocessingShape" mc:Ignorable="w14 w15 w16se wp14">
   <w:body>
     <w:p>
       <w:pPr>
@@ -1365,7 +1365,23 @@
       </w:pPr>
       <w:r>
         <w:lastRenderedPageBreak/>
-        <w:t>In the new pop- Name the directory anything beginning with “/”(for this sample, it is named “/Videos”). And then enter the file path used for the virtual directory. This should be the same file path used in the PLC code.</w:t>
+        <w:t>In the new pop-</w:t>
+      </w:r>
+      <w:r>
+        <w:t>up</w:t>
+      </w:r>
+      <w:bookmarkStart w:id="6" w:name="_GoBack"/>
+      <w:bookmarkEnd w:id="6"/>
+      <w:r>
+        <w:t xml:space="preserve"> Name the directory anything beginning with “/</w:t>
+      </w:r>
+      <w:proofErr w:type="gramStart"/>
+      <w:r>
+        <w:t>”(</w:t>
+      </w:r>
+      <w:proofErr w:type="gramEnd"/>
+      <w:r>
+        <w:t>for this sample, it is named “/Videos”). And then enter the file path used for the virtual directory. This should be the same file path used in the PLC code.</w:t>
       </w:r>
     </w:p>
     <w:p>
@@ -1578,7 +1594,15 @@
       </w:r>
       <w:proofErr w:type="spellEnd"/>
       <w:r>
-        <w:t>” property of the variable. First, by turning each part of the time stamp into its own string, and then concatenating them into the file name. the function used for certain parts named “number2string” is used to be sure that single digit values have a “0” placed before them to match the format of the timestamp.</w:t>
+        <w:t xml:space="preserve">” property of the variable. First, by turning each part of the time stamp into its own string, and then concatenating them into the file name. </w:t>
+      </w:r>
+      <w:proofErr w:type="gramStart"/>
+      <w:r>
+        <w:t>the</w:t>
+      </w:r>
+      <w:proofErr w:type="gramEnd"/>
+      <w:r>
+        <w:t xml:space="preserve"> function used for certain parts named “number2string” is used to be sure that single digit values have a “0” placed before them to match the format of the timestamp.</w:t>
       </w:r>
     </w:p>
     <w:p>
@@ -1882,12 +1906,17 @@
         <w:t xml:space="preserve"> is complete, the contents will be returned through a callback. The Promise checks the data returned in the “</w:t>
       </w:r>
       <w:proofErr w:type="spellStart"/>
+      <w:proofErr w:type="gramStart"/>
       <w:r>
         <w:t>data.results</w:t>
       </w:r>
       <w:proofErr w:type="spellEnd"/>
       <w:r>
-        <w:t xml:space="preserve">[]” object to see if there is a value with a key matching the file name it was passed. If it was found the </w:t>
+        <w:t>[</w:t>
+      </w:r>
+      <w:proofErr w:type="gramEnd"/>
+      <w:r>
+        <w:t xml:space="preserve">]” object to see if there is a value with a key matching the file name it was passed. If it was found the </w:t>
       </w:r>
       <w:proofErr w:type="spellStart"/>
       <w:r>
@@ -1972,11 +2001,11 @@
       <w:pPr>
         <w:pStyle w:val="Heading3"/>
       </w:pPr>
-      <w:bookmarkStart w:id="6" w:name="_Toc94858850"/>
+      <w:bookmarkStart w:id="7" w:name="_Toc94858850"/>
       <w:r>
         <w:t>PLC Setup</w:t>
       </w:r>
-      <w:bookmarkEnd w:id="6"/>
+      <w:bookmarkEnd w:id="7"/>
       <w:r>
         <w:t xml:space="preserve"> </w:t>
       </w:r>
@@ -1986,11 +2015,11 @@
       <w:pPr>
         <w:pStyle w:val="Heading3"/>
       </w:pPr>
-      <w:bookmarkStart w:id="7" w:name="_Toc94858851"/>
+      <w:bookmarkStart w:id="8" w:name="_Toc94858851"/>
       <w:r>
         <w:t>Scope Setup</w:t>
       </w:r>
-      <w:bookmarkEnd w:id="7"/>
+      <w:bookmarkEnd w:id="8"/>
     </w:p>
     <w:sectPr>
       <w:pgSz w:w="12240" w:h="15840"/>
@@ -2003,7 +2032,7 @@
 </file>
 
 <file path=word/numbering.xml><?xml version="1.0" encoding="utf-8"?>
-<w:numbering xmlns:wpc="http://schemas.microsoft.com/office/word/2010/wordprocessingCanvas" xmlns:cx="http://schemas.microsoft.com/office/drawing/2014/chartex" xmlns:cx1="http://schemas.microsoft.com/office/drawing/2015/9/8/chartex" xmlns:cx2="http://schemas.microsoft.com/office/drawing/2015/10/21/chartex" xmlns:cx3="http://schemas.microsoft.com/office/drawing/2016/5/9/chartex" xmlns:cx4="http://schemas.microsoft.com/office/drawing/2016/5/10/chartex" xmlns:cx5="http://schemas.microsoft.com/office/drawing/2016/5/11/chartex" xmlns:cx6="http://schemas.microsoft.com/office/drawing/2016/5/12/chartex" xmlns:cx7="http://schemas.microsoft.com/office/drawing/2016/5/13/chartex" xmlns:cx8="http://schemas.microsoft.com/office/drawing/2016/5/14/chartex" xmlns:mc="http://schemas.openxmlformats.org/markup-compatibility/2006" xmlns:aink="http://schemas.microsoft.com/office/drawing/2016/ink" xmlns:am3d="http://schemas.microsoft.com/office/drawing/2017/model3d" xmlns:o="urn:schemas-microsoft-com:office:office" xmlns:r="http://schemas.openxmlformats.org/officeDocument/2006/relationships" xmlns:m="http://schemas.openxmlformats.org/officeDocument/2006/math" xmlns:v="urn:schemas-microsoft-com:vml" xmlns:wp14="http://schemas.microsoft.com/office/word/2010/wordprocessingDrawing" xmlns:wp="http://schemas.openxmlformats.org/drawingml/2006/wordprocessingDrawing" xmlns:w10="urn:schemas-microsoft-com:office:word" xmlns:w="http://schemas.openxmlformats.org/wordprocessingml/2006/main" xmlns:w14="http://schemas.microsoft.com/office/word/2010/wordml" xmlns:w15="http://schemas.microsoft.com/office/word/2012/wordml" xmlns:w16cex="http://schemas.microsoft.com/office/word/2018/wordml/cex" xmlns:w16cid="http://schemas.microsoft.com/office/word/2016/wordml/cid" xmlns:w16="http://schemas.microsoft.com/office/word/2018/wordml" xmlns:w16sdtdh="http://schemas.microsoft.com/office/word/2020/wordml/sdtdatahash" xmlns:w16se="http://schemas.microsoft.com/office/word/2015/wordml/symex" xmlns:wpg="http://schemas.microsoft.com/office/word/2010/wordprocessingGroup" xmlns:wpi="http://schemas.microsoft.com/office/word/2010/wordprocessingInk" xmlns:wne="http://schemas.microsoft.com/office/word/2006/wordml" xmlns:wps="http://schemas.microsoft.com/office/word/2010/wordprocessingShape" mc:Ignorable="w14 w15 w16se w16cid w16 w16cex w16sdtdh wp14">
+<w:numbering xmlns:wpc="http://schemas.microsoft.com/office/word/2010/wordprocessingCanvas" xmlns:cx="http://schemas.microsoft.com/office/drawing/2014/chartex" xmlns:cx1="http://schemas.microsoft.com/office/drawing/2015/9/8/chartex" xmlns:mc="http://schemas.openxmlformats.org/markup-compatibility/2006" xmlns:o="urn:schemas-microsoft-com:office:office" xmlns:r="http://schemas.openxmlformats.org/officeDocument/2006/relationships" xmlns:m="http://schemas.openxmlformats.org/officeDocument/2006/math" xmlns:v="urn:schemas-microsoft-com:vml" xmlns:wp14="http://schemas.microsoft.com/office/word/2010/wordprocessingDrawing" xmlns:wp="http://schemas.openxmlformats.org/drawingml/2006/wordprocessingDrawing" xmlns:w10="urn:schemas-microsoft-com:office:word" xmlns:w="http://schemas.openxmlformats.org/wordprocessingml/2006/main" xmlns:w14="http://schemas.microsoft.com/office/word/2010/wordml" xmlns:w15="http://schemas.microsoft.com/office/word/2012/wordml" xmlns:w16se="http://schemas.microsoft.com/office/word/2015/wordml/symex" xmlns:wpg="http://schemas.microsoft.com/office/word/2010/wordprocessingGroup" xmlns:wpi="http://schemas.microsoft.com/office/word/2010/wordprocessingInk" xmlns:wne="http://schemas.microsoft.com/office/word/2006/wordml" xmlns:wps="http://schemas.microsoft.com/office/word/2010/wordprocessingShape" mc:Ignorable="w14 w15 w16se wp14">
   <w:abstractNum w:abstractNumId="0" w15:restartNumberingAfterBreak="0">
     <w:nsid w:val="18360117"/>
     <w:multiLevelType w:val="hybridMultilevel"/>
@@ -2284,7 +2313,7 @@
 </file>
 
 <file path=word/styles.xml><?xml version="1.0" encoding="utf-8"?>
-<w:styles xmlns:mc="http://schemas.openxmlformats.org/markup-compatibility/2006" xmlns:r="http://schemas.openxmlformats.org/officeDocument/2006/relationships" xmlns:w="http://schemas.openxmlformats.org/wordprocessingml/2006/main" xmlns:w14="http://schemas.microsoft.com/office/word/2010/wordml" xmlns:w15="http://schemas.microsoft.com/office/word/2012/wordml" xmlns:w16cex="http://schemas.microsoft.com/office/word/2018/wordml/cex" xmlns:w16cid="http://schemas.microsoft.com/office/word/2016/wordml/cid" xmlns:w16="http://schemas.microsoft.com/office/word/2018/wordml" xmlns:w16sdtdh="http://schemas.microsoft.com/office/word/2020/wordml/sdtdatahash" xmlns:w16se="http://schemas.microsoft.com/office/word/2015/wordml/symex" mc:Ignorable="w14 w15 w16se w16cid w16 w16cex w16sdtdh">
+<w:styles xmlns:mc="http://schemas.openxmlformats.org/markup-compatibility/2006" xmlns:r="http://schemas.openxmlformats.org/officeDocument/2006/relationships" xmlns:w="http://schemas.openxmlformats.org/wordprocessingml/2006/main" xmlns:w14="http://schemas.microsoft.com/office/word/2010/wordml" xmlns:w15="http://schemas.microsoft.com/office/word/2012/wordml" xmlns:w16se="http://schemas.microsoft.com/office/word/2015/wordml/symex" mc:Ignorable="w14 w15 w16se">
   <w:docDefaults>
     <w:rPrDefault>
       <w:rPr>
@@ -2300,7 +2329,7 @@
       </w:pPr>
     </w:pPrDefault>
   </w:docDefaults>
-  <w:latentStyles w:defLockedState="0" w:defUIPriority="99" w:defSemiHidden="0" w:defUnhideWhenUsed="0" w:defQFormat="0" w:count="376">
+  <w:latentStyles w:defLockedState="0" w:defUIPriority="99" w:defSemiHidden="0" w:defUnhideWhenUsed="0" w:defQFormat="0" w:count="371">
     <w:lsdException w:name="Normal" w:uiPriority="0" w:qFormat="1"/>
     <w:lsdException w:name="heading 1" w:uiPriority="9" w:qFormat="1"/>
     <w:lsdException w:name="heading 2" w:semiHidden="1" w:uiPriority="9" w:unhideWhenUsed="1" w:qFormat="1"/>
@@ -2672,11 +2701,6 @@
     <w:lsdException w:name="List Table 5 Dark Accent 6" w:uiPriority="50"/>
     <w:lsdException w:name="List Table 6 Colorful Accent 6" w:uiPriority="51"/>
     <w:lsdException w:name="List Table 7 Colorful Accent 6" w:uiPriority="52"/>
-    <w:lsdException w:name="Mention" w:semiHidden="1" w:unhideWhenUsed="1"/>
-    <w:lsdException w:name="Smart Hyperlink" w:semiHidden="1" w:unhideWhenUsed="1"/>
-    <w:lsdException w:name="Hashtag" w:semiHidden="1" w:unhideWhenUsed="1"/>
-    <w:lsdException w:name="Unresolved Mention" w:semiHidden="1" w:unhideWhenUsed="1"/>
-    <w:lsdException w:name="Smart Link" w:semiHidden="1" w:unhideWhenUsed="1"/>
   </w:latentStyles>
   <w:style w:type="paragraph" w:default="1" w:styleId="Normal">
     <w:name w:val="Normal"/>
@@ -3223,25 +3247,6 @@
 </file>
 
 <file path=customXml/item1.xml><?xml version="1.0" encoding="utf-8"?>
-<p:properties xmlns:p="http://schemas.microsoft.com/office/2006/metadata/properties" xmlns:xsi="http://www.w3.org/2001/XMLSchema-instance" xmlns:pc="http://schemas.microsoft.com/office/infopath/2007/PartnerControls">
-  <documentManagement/>
-</p:properties>
-</file>
-
-<file path=customXml/item2.xml><?xml version="1.0" encoding="utf-8"?>
-<b:Sources xmlns:b="http://schemas.openxmlformats.org/officeDocument/2006/bibliography" xmlns="http://schemas.openxmlformats.org/officeDocument/2006/bibliography" SelectedStyle="\APASixthEditionOfficeOnline.xsl" StyleName="APA" Version="6"/>
-</file>
-
-<file path=customXml/item3.xml><?xml version="1.0" encoding="utf-8"?>
-<?mso-contentType ?>
-<FormTemplates xmlns="http://schemas.microsoft.com/sharepoint/v3/contenttype/forms">
-  <Display>DocumentLibraryForm</Display>
-  <Edit>DocumentLibraryForm</Edit>
-  <New>DocumentLibraryForm</New>
-</FormTemplates>
-</file>
-
-<file path=customXml/item4.xml><?xml version="1.0" encoding="utf-8"?>
 <ct:contentTypeSchema xmlns:ct="http://schemas.microsoft.com/office/2006/metadata/contentType" xmlns:ma="http://schemas.microsoft.com/office/2006/metadata/properties/metaAttributes" ct:_="" ma:_="" ma:contentTypeName="Document" ma:contentTypeID="0x010100EE6E5C1C5B7B974290FEB10D1DCD8D31" ma:contentTypeVersion="12" ma:contentTypeDescription="Create a new document." ma:contentTypeScope="" ma:versionID="78699b2bd89bf2845925dba2fad9cd5f">
   <xsd:schema xmlns:xsd="http://www.w3.org/2001/XMLSchema" xmlns:xs="http://www.w3.org/2001/XMLSchema" xmlns:p="http://schemas.microsoft.com/office/2006/metadata/properties" xmlns:ns2="c69c2809-a790-48a5-85c4-6c52d07a2bbc" xmlns:ns3="302a1acb-8782-4a7a-ac83-47184c60ed90" targetNamespace="http://schemas.microsoft.com/office/2006/metadata/properties" ma:root="true" ma:fieldsID="7016652cebf24c8fab966be4d9fc64bd" ns2:_="" ns3:_="">
     <xsd:import namespace="c69c2809-a790-48a5-85c4-6c52d07a2bbc"/>
@@ -3458,32 +3463,26 @@
 </ct:contentTypeSchema>
 </file>
 
-<file path=customXml/itemProps1.xml><?xml version="1.0" encoding="utf-8"?>
-<ds:datastoreItem xmlns:ds="http://schemas.openxmlformats.org/officeDocument/2006/customXml" ds:itemID="{1BC7191A-1CC0-4233-8666-F5564399F7F1}">
-  <ds:schemaRefs>
-    <ds:schemaRef ds:uri="http://schemas.microsoft.com/office/2006/metadata/properties"/>
-    <ds:schemaRef ds:uri="http://schemas.microsoft.com/office/infopath/2007/PartnerControls"/>
-  </ds:schemaRefs>
-</ds:datastoreItem>
+<file path=customXml/item2.xml><?xml version="1.0" encoding="utf-8"?>
+<?mso-contentType ?>
+<FormTemplates xmlns="http://schemas.microsoft.com/sharepoint/v3/contenttype/forms">
+  <Display>DocumentLibraryForm</Display>
+  <Edit>DocumentLibraryForm</Edit>
+  <New>DocumentLibraryForm</New>
+</FormTemplates>
 </file>
 
-<file path=customXml/itemProps2.xml><?xml version="1.0" encoding="utf-8"?>
-<ds:datastoreItem xmlns:ds="http://schemas.openxmlformats.org/officeDocument/2006/customXml" ds:itemID="{DEAA1C43-CD60-487F-ACAF-54F186CB0593}">
-  <ds:schemaRefs>
-    <ds:schemaRef ds:uri="http://schemas.openxmlformats.org/officeDocument/2006/bibliography"/>
-  </ds:schemaRefs>
-</ds:datastoreItem>
+<file path=customXml/item3.xml><?xml version="1.0" encoding="utf-8"?>
+<p:properties xmlns:p="http://schemas.microsoft.com/office/2006/metadata/properties" xmlns:xsi="http://www.w3.org/2001/XMLSchema-instance" xmlns:pc="http://schemas.microsoft.com/office/infopath/2007/PartnerControls">
+  <documentManagement/>
+</p:properties>
 </file>
 
-<file path=customXml/itemProps3.xml><?xml version="1.0" encoding="utf-8"?>
-<ds:datastoreItem xmlns:ds="http://schemas.openxmlformats.org/officeDocument/2006/customXml" ds:itemID="{6D958086-F2B3-47C3-8FF6-E5FE965A77C1}">
-  <ds:schemaRefs>
-    <ds:schemaRef ds:uri="http://schemas.microsoft.com/sharepoint/v3/contenttype/forms"/>
-  </ds:schemaRefs>
-</ds:datastoreItem>
+<file path=customXml/item4.xml><?xml version="1.0" encoding="utf-8"?>
+<b:Sources xmlns:b="http://schemas.openxmlformats.org/officeDocument/2006/bibliography" xmlns="http://schemas.openxmlformats.org/officeDocument/2006/bibliography" SelectedStyle="\APASixthEditionOfficeOnline.xsl" StyleName="APA" Version="6"/>
 </file>
 
-<file path=customXml/itemProps4.xml><?xml version="1.0" encoding="utf-8"?>
+<file path=customXml/itemProps1.xml><?xml version="1.0" encoding="utf-8"?>
 <ds:datastoreItem xmlns:ds="http://schemas.openxmlformats.org/officeDocument/2006/customXml" ds:itemID="{C7A87FEE-1A31-4CC1-9604-C506A491127C}">
   <ds:schemaRefs>
     <ds:schemaRef ds:uri="http://schemas.microsoft.com/office/2006/metadata/contentType"/>
@@ -3500,4 +3499,29 @@
     <ds:schemaRef ds:uri="http://schemas.microsoft.com/internal/obd"/>
   </ds:schemaRefs>
 </ds:datastoreItem>
+</file>
+
+<file path=customXml/itemProps2.xml><?xml version="1.0" encoding="utf-8"?>
+<ds:datastoreItem xmlns:ds="http://schemas.openxmlformats.org/officeDocument/2006/customXml" ds:itemID="{6D958086-F2B3-47C3-8FF6-E5FE965A77C1}">
+  <ds:schemaRefs>
+    <ds:schemaRef ds:uri="http://schemas.microsoft.com/sharepoint/v3/contenttype/forms"/>
+  </ds:schemaRefs>
+</ds:datastoreItem>
+</file>
+
+<file path=customXml/itemProps3.xml><?xml version="1.0" encoding="utf-8"?>
+<ds:datastoreItem xmlns:ds="http://schemas.openxmlformats.org/officeDocument/2006/customXml" ds:itemID="{1BC7191A-1CC0-4233-8666-F5564399F7F1}">
+  <ds:schemaRefs>
+    <ds:schemaRef ds:uri="http://schemas.microsoft.com/office/2006/metadata/properties"/>
+    <ds:schemaRef ds:uri="http://schemas.microsoft.com/office/infopath/2007/PartnerControls"/>
+  </ds:schemaRefs>
+</ds:datastoreItem>
+</file>
+
+<file path=customXml/itemProps4.xml><?xml version="1.0" encoding="utf-8"?>
+<ds:datastoreItem xmlns:ds="http://schemas.openxmlformats.org/officeDocument/2006/customXml" ds:itemID="{297AC83C-7FCB-475E-AFDA-5269F134849B}">
+  <ds:schemaRefs>
+    <ds:schemaRef ds:uri="http://schemas.openxmlformats.org/officeDocument/2006/bibliography"/>
+  </ds:schemaRefs>
+</ds:datastoreItem>
 </file>
</xml_diff>